<commit_message>
Translate trainer docstrings to English; add report TOC and update run path
</commit_message>
<xml_diff>
--- a/docs/report/25029204-NAS-Assessment3-TechnicalReport.docx
+++ b/docs/report/25029204-NAS-Assessment3-TechnicalReport.docx
@@ -1789,9 +1789,14 @@
       </w:pPr>
     </w:p>
     <w:p>
+      <w:r>
+        <w:br w:type="page"/>
+      </w:r>
+    </w:p>
+    <w:p>
       <w:pPr>
         <w:pStyle w:val="Normal"/>
-        <w:jc w:val="center"/>
+        <w:jc w:val="left"/>
         <w:rPr>
           <w:rFonts w:ascii="Arial" w:hAnsi="Arial" w:eastAsia="Arial" w:cs="Arial"/>
           <w:b w:val="0"/>
@@ -1807,6 +1812,3017 @@
           <w:lang w:val="pt-BR"/>
         </w:rPr>
       </w:pPr>
+      <w:r>
+        <w:rPr>
+          <w:rFonts w:ascii="Arial" w:hAnsi="Arial" w:eastAsia="Arial" w:cs="Arial"/>
+          <w:b w:val="0"/>
+          <w:bCs w:val="0"/>
+          <w:i w:val="0"/>
+          <w:iCs w:val="0"/>
+          <w:caps w:val="0"/>
+          <w:smallCaps w:val="0"/>
+          <w:noProof w:val="0"/>
+          <w:color w:val="auto"/>
+          <w:sz w:val="28"/>
+          <w:szCs w:val="28"/>
+          <w:lang w:val="pt-BR"/>
+        </w:rPr>
+        <w:t>Table</w:t>
+      </w:r>
+      <w:r>
+        <w:rPr>
+          <w:rFonts w:ascii="Arial" w:hAnsi="Arial" w:eastAsia="Arial" w:cs="Arial"/>
+          <w:b w:val="0"/>
+          <w:bCs w:val="0"/>
+          <w:i w:val="0"/>
+          <w:iCs w:val="0"/>
+          <w:caps w:val="0"/>
+          <w:smallCaps w:val="0"/>
+          <w:noProof w:val="0"/>
+          <w:color w:val="auto"/>
+          <w:sz w:val="28"/>
+          <w:szCs w:val="28"/>
+          <w:lang w:val="pt-BR"/>
+        </w:rPr>
+        <w:t xml:space="preserve"> </w:t>
+      </w:r>
+      <w:r>
+        <w:rPr>
+          <w:rFonts w:ascii="Arial" w:hAnsi="Arial" w:eastAsia="Arial" w:cs="Arial"/>
+          <w:b w:val="0"/>
+          <w:bCs w:val="0"/>
+          <w:i w:val="0"/>
+          <w:iCs w:val="0"/>
+          <w:caps w:val="0"/>
+          <w:smallCaps w:val="0"/>
+          <w:noProof w:val="0"/>
+          <w:color w:val="auto"/>
+          <w:sz w:val="28"/>
+          <w:szCs w:val="28"/>
+          <w:lang w:val="pt-BR"/>
+        </w:rPr>
+        <w:t>of</w:t>
+      </w:r>
+      <w:r>
+        <w:rPr>
+          <w:rFonts w:ascii="Arial" w:hAnsi="Arial" w:eastAsia="Arial" w:cs="Arial"/>
+          <w:b w:val="0"/>
+          <w:bCs w:val="0"/>
+          <w:i w:val="0"/>
+          <w:iCs w:val="0"/>
+          <w:caps w:val="0"/>
+          <w:smallCaps w:val="0"/>
+          <w:noProof w:val="0"/>
+          <w:color w:val="auto"/>
+          <w:sz w:val="28"/>
+          <w:szCs w:val="28"/>
+          <w:lang w:val="pt-BR"/>
+        </w:rPr>
+        <w:t xml:space="preserve"> Contents</w:t>
+      </w:r>
+    </w:p>
+    <w:sdt>
+      <w:sdtPr>
+        <w:id w:val="704518710"/>
+        <w:docPartObj>
+          <w:docPartGallery w:val="Table of Contents"/>
+          <w:docPartUnique/>
+        </w:docPartObj>
+      </w:sdtPr>
+      <w:sdtContent>
+        <w:p>
+          <w:pPr>
+            <w:pStyle w:val="TOC1"/>
+            <w:tabs>
+              <w:tab w:val="right" w:leader="dot" w:pos="9735"/>
+            </w:tabs>
+            <w:bidi w:val="0"/>
+            <w:rPr>
+              <w:rStyle w:val="Hyperlink"/>
+            </w:rPr>
+          </w:pPr>
+          <w:r>
+            <w:fldChar w:fldCharType="begin"/>
+          </w:r>
+          <w:r>
+            <w:instrText xml:space="preserve">TOC \o "1-9" \z \u \h</w:instrText>
+          </w:r>
+          <w:r>
+            <w:fldChar w:fldCharType="separate"/>
+          </w:r>
+          <w:hyperlink w:anchor="_Toc586859991">
+            <w:r>
+              <w:rPr>
+                <w:rStyle w:val="Hyperlink"/>
+              </w:rPr>
+              <w:t>1. Introduction</w:t>
+            </w:r>
+            <w:r>
+              <w:tab/>
+            </w:r>
+            <w:r>
+              <w:fldChar w:fldCharType="begin"/>
+            </w:r>
+            <w:r>
+              <w:instrText xml:space="preserve">PAGEREF _Toc586859991 \h</w:instrText>
+            </w:r>
+            <w:r>
+              <w:fldChar w:fldCharType="separate"/>
+            </w:r>
+            <w:r>
+              <w:rPr>
+                <w:rStyle w:val="Hyperlink"/>
+              </w:rPr>
+              <w:t>3</w:t>
+            </w:r>
+            <w:r>
+              <w:fldChar w:fldCharType="end"/>
+            </w:r>
+          </w:hyperlink>
+        </w:p>
+        <w:p>
+          <w:pPr>
+            <w:pStyle w:val="TOC2"/>
+            <w:tabs>
+              <w:tab w:val="right" w:leader="dot" w:pos="9735"/>
+            </w:tabs>
+            <w:bidi w:val="0"/>
+            <w:rPr>
+              <w:rStyle w:val="Hyperlink"/>
+            </w:rPr>
+          </w:pPr>
+          <w:hyperlink w:anchor="_Toc1812750393">
+            <w:r>
+              <w:rPr>
+                <w:rStyle w:val="Hyperlink"/>
+              </w:rPr>
+              <w:t>1.1 Motivation</w:t>
+            </w:r>
+            <w:r>
+              <w:tab/>
+            </w:r>
+            <w:r>
+              <w:fldChar w:fldCharType="begin"/>
+            </w:r>
+            <w:r>
+              <w:instrText xml:space="preserve">PAGEREF _Toc1812750393 \h</w:instrText>
+            </w:r>
+            <w:r>
+              <w:fldChar w:fldCharType="separate"/>
+            </w:r>
+            <w:r>
+              <w:rPr>
+                <w:rStyle w:val="Hyperlink"/>
+              </w:rPr>
+              <w:t>4</w:t>
+            </w:r>
+            <w:r>
+              <w:fldChar w:fldCharType="end"/>
+            </w:r>
+          </w:hyperlink>
+        </w:p>
+        <w:p>
+          <w:pPr>
+            <w:pStyle w:val="TOC2"/>
+            <w:tabs>
+              <w:tab w:val="right" w:leader="dot" w:pos="9735"/>
+            </w:tabs>
+            <w:bidi w:val="0"/>
+            <w:rPr>
+              <w:rStyle w:val="Hyperlink"/>
+            </w:rPr>
+          </w:pPr>
+          <w:hyperlink w:anchor="_Toc1502868997">
+            <w:r>
+              <w:rPr>
+                <w:rStyle w:val="Hyperlink"/>
+              </w:rPr>
+              <w:t>1.2 The evolution of Neural Networks</w:t>
+            </w:r>
+            <w:r>
+              <w:tab/>
+            </w:r>
+            <w:r>
+              <w:fldChar w:fldCharType="begin"/>
+            </w:r>
+            <w:r>
+              <w:instrText xml:space="preserve">PAGEREF _Toc1502868997 \h</w:instrText>
+            </w:r>
+            <w:r>
+              <w:fldChar w:fldCharType="separate"/>
+            </w:r>
+            <w:r>
+              <w:rPr>
+                <w:rStyle w:val="Hyperlink"/>
+              </w:rPr>
+              <w:t>4</w:t>
+            </w:r>
+            <w:r>
+              <w:fldChar w:fldCharType="end"/>
+            </w:r>
+          </w:hyperlink>
+        </w:p>
+        <w:p>
+          <w:pPr>
+            <w:pStyle w:val="TOC2"/>
+            <w:tabs>
+              <w:tab w:val="right" w:leader="dot" w:pos="9735"/>
+            </w:tabs>
+            <w:bidi w:val="0"/>
+            <w:rPr>
+              <w:rStyle w:val="Hyperlink"/>
+            </w:rPr>
+          </w:pPr>
+          <w:hyperlink w:anchor="_Toc1222365834">
+            <w:r>
+              <w:rPr>
+                <w:rStyle w:val="Hyperlink"/>
+              </w:rPr>
+              <w:t>1.3 Research Aim and Contributions</w:t>
+            </w:r>
+            <w:r>
+              <w:tab/>
+            </w:r>
+            <w:r>
+              <w:fldChar w:fldCharType="begin"/>
+            </w:r>
+            <w:r>
+              <w:instrText xml:space="preserve">PAGEREF _Toc1222365834 \h</w:instrText>
+            </w:r>
+            <w:r>
+              <w:fldChar w:fldCharType="separate"/>
+            </w:r>
+            <w:r>
+              <w:rPr>
+                <w:rStyle w:val="Hyperlink"/>
+              </w:rPr>
+              <w:t>4</w:t>
+            </w:r>
+            <w:r>
+              <w:fldChar w:fldCharType="end"/>
+            </w:r>
+          </w:hyperlink>
+        </w:p>
+        <w:p>
+          <w:pPr>
+            <w:pStyle w:val="TOC1"/>
+            <w:tabs>
+              <w:tab w:val="right" w:leader="dot" w:pos="9735"/>
+            </w:tabs>
+            <w:bidi w:val="0"/>
+            <w:rPr>
+              <w:rStyle w:val="Hyperlink"/>
+            </w:rPr>
+          </w:pPr>
+          <w:hyperlink w:anchor="_Toc1899335751">
+            <w:r>
+              <w:rPr>
+                <w:rStyle w:val="Hyperlink"/>
+              </w:rPr>
+              <w:t>2. Programme Alignment</w:t>
+            </w:r>
+            <w:r>
+              <w:tab/>
+            </w:r>
+            <w:r>
+              <w:fldChar w:fldCharType="begin"/>
+            </w:r>
+            <w:r>
+              <w:instrText xml:space="preserve">PAGEREF _Toc1899335751 \h</w:instrText>
+            </w:r>
+            <w:r>
+              <w:fldChar w:fldCharType="separate"/>
+            </w:r>
+            <w:r>
+              <w:rPr>
+                <w:rStyle w:val="Hyperlink"/>
+              </w:rPr>
+              <w:t>5</w:t>
+            </w:r>
+            <w:r>
+              <w:fldChar w:fldCharType="end"/>
+            </w:r>
+          </w:hyperlink>
+        </w:p>
+        <w:p>
+          <w:pPr>
+            <w:pStyle w:val="TOC1"/>
+            <w:tabs>
+              <w:tab w:val="right" w:leader="dot" w:pos="9735"/>
+            </w:tabs>
+            <w:bidi w:val="0"/>
+            <w:rPr>
+              <w:rStyle w:val="Hyperlink"/>
+            </w:rPr>
+          </w:pPr>
+          <w:hyperlink w:anchor="_Toc810830369">
+            <w:r>
+              <w:rPr>
+                <w:rStyle w:val="Hyperlink"/>
+              </w:rPr>
+              <w:t>3. Literature Review</w:t>
+            </w:r>
+            <w:r>
+              <w:tab/>
+            </w:r>
+            <w:r>
+              <w:fldChar w:fldCharType="begin"/>
+            </w:r>
+            <w:r>
+              <w:instrText xml:space="preserve">PAGEREF _Toc810830369 \h</w:instrText>
+            </w:r>
+            <w:r>
+              <w:fldChar w:fldCharType="separate"/>
+            </w:r>
+            <w:r>
+              <w:rPr>
+                <w:rStyle w:val="Hyperlink"/>
+              </w:rPr>
+              <w:t>5</w:t>
+            </w:r>
+            <w:r>
+              <w:fldChar w:fldCharType="end"/>
+            </w:r>
+          </w:hyperlink>
+        </w:p>
+        <w:p>
+          <w:pPr>
+            <w:pStyle w:val="TOC2"/>
+            <w:tabs>
+              <w:tab w:val="right" w:leader="dot" w:pos="9735"/>
+            </w:tabs>
+            <w:bidi w:val="0"/>
+            <w:rPr>
+              <w:rStyle w:val="Hyperlink"/>
+            </w:rPr>
+          </w:pPr>
+          <w:hyperlink w:anchor="_Toc1768056434">
+            <w:r>
+              <w:rPr>
+                <w:rStyle w:val="Hyperlink"/>
+              </w:rPr>
+              <w:t>3.1 Deep Neural Networks and the Architecture Design Problem</w:t>
+            </w:r>
+            <w:r>
+              <w:tab/>
+            </w:r>
+            <w:r>
+              <w:fldChar w:fldCharType="begin"/>
+            </w:r>
+            <w:r>
+              <w:instrText xml:space="preserve">PAGEREF _Toc1768056434 \h</w:instrText>
+            </w:r>
+            <w:r>
+              <w:fldChar w:fldCharType="separate"/>
+            </w:r>
+            <w:r>
+              <w:rPr>
+                <w:rStyle w:val="Hyperlink"/>
+              </w:rPr>
+              <w:t>5</w:t>
+            </w:r>
+            <w:r>
+              <w:fldChar w:fldCharType="end"/>
+            </w:r>
+          </w:hyperlink>
+        </w:p>
+        <w:p>
+          <w:pPr>
+            <w:pStyle w:val="TOC2"/>
+            <w:tabs>
+              <w:tab w:val="right" w:leader="dot" w:pos="9735"/>
+            </w:tabs>
+            <w:bidi w:val="0"/>
+            <w:rPr>
+              <w:rStyle w:val="Hyperlink"/>
+            </w:rPr>
+          </w:pPr>
+          <w:hyperlink w:anchor="_Toc559349959">
+            <w:r>
+              <w:rPr>
+                <w:rStyle w:val="Hyperlink"/>
+              </w:rPr>
+              <w:t>3.2 Neural Architecture Search Foundations</w:t>
+            </w:r>
+            <w:r>
+              <w:tab/>
+            </w:r>
+            <w:r>
+              <w:fldChar w:fldCharType="begin"/>
+            </w:r>
+            <w:r>
+              <w:instrText xml:space="preserve">PAGEREF _Toc559349959 \h</w:instrText>
+            </w:r>
+            <w:r>
+              <w:fldChar w:fldCharType="separate"/>
+            </w:r>
+            <w:r>
+              <w:rPr>
+                <w:rStyle w:val="Hyperlink"/>
+              </w:rPr>
+              <w:t>6</w:t>
+            </w:r>
+            <w:r>
+              <w:fldChar w:fldCharType="end"/>
+            </w:r>
+          </w:hyperlink>
+        </w:p>
+        <w:p>
+          <w:pPr>
+            <w:pStyle w:val="TOC4"/>
+            <w:tabs>
+              <w:tab w:val="right" w:leader="dot" w:pos="9735"/>
+            </w:tabs>
+            <w:bidi w:val="0"/>
+            <w:rPr>
+              <w:rStyle w:val="Hyperlink"/>
+            </w:rPr>
+          </w:pPr>
+          <w:hyperlink w:anchor="_Toc871030335">
+            <w:r>
+              <w:rPr>
+                <w:rStyle w:val="Hyperlink"/>
+              </w:rPr>
+              <w:t>Figure 1: Illustration of NAS three fundamental components</w:t>
+            </w:r>
+            <w:r>
+              <w:tab/>
+            </w:r>
+            <w:r>
+              <w:fldChar w:fldCharType="begin"/>
+            </w:r>
+            <w:r>
+              <w:instrText xml:space="preserve">PAGEREF _Toc871030335 \h</w:instrText>
+            </w:r>
+            <w:r>
+              <w:fldChar w:fldCharType="separate"/>
+            </w:r>
+            <w:r>
+              <w:rPr>
+                <w:rStyle w:val="Hyperlink"/>
+              </w:rPr>
+              <w:t>7</w:t>
+            </w:r>
+            <w:r>
+              <w:fldChar w:fldCharType="end"/>
+            </w:r>
+          </w:hyperlink>
+        </w:p>
+        <w:p>
+          <w:pPr>
+            <w:pStyle w:val="TOC2"/>
+            <w:tabs>
+              <w:tab w:val="right" w:leader="dot" w:pos="9735"/>
+            </w:tabs>
+            <w:bidi w:val="0"/>
+            <w:rPr>
+              <w:rStyle w:val="Hyperlink"/>
+            </w:rPr>
+          </w:pPr>
+          <w:hyperlink w:anchor="_Toc1935293189">
+            <w:r>
+              <w:rPr>
+                <w:rStyle w:val="Hyperlink"/>
+              </w:rPr>
+              <w:t>3.3 Classical NAS Paradigms</w:t>
+            </w:r>
+            <w:r>
+              <w:tab/>
+            </w:r>
+            <w:r>
+              <w:fldChar w:fldCharType="begin"/>
+            </w:r>
+            <w:r>
+              <w:instrText xml:space="preserve">PAGEREF _Toc1935293189 \h</w:instrText>
+            </w:r>
+            <w:r>
+              <w:fldChar w:fldCharType="separate"/>
+            </w:r>
+            <w:r>
+              <w:rPr>
+                <w:rStyle w:val="Hyperlink"/>
+              </w:rPr>
+              <w:t>7</w:t>
+            </w:r>
+            <w:r>
+              <w:fldChar w:fldCharType="end"/>
+            </w:r>
+          </w:hyperlink>
+        </w:p>
+        <w:p>
+          <w:pPr>
+            <w:pStyle w:val="TOC2"/>
+            <w:tabs>
+              <w:tab w:val="right" w:leader="dot" w:pos="9735"/>
+            </w:tabs>
+            <w:bidi w:val="0"/>
+            <w:rPr>
+              <w:rStyle w:val="Hyperlink"/>
+            </w:rPr>
+          </w:pPr>
+          <w:hyperlink w:anchor="_Toc807765269">
+            <w:r>
+              <w:rPr>
+                <w:rStyle w:val="Hyperlink"/>
+              </w:rPr>
+              <w:t>3.3.1 Reinforcement Learning-Based NAS</w:t>
+            </w:r>
+            <w:r>
+              <w:tab/>
+            </w:r>
+            <w:r>
+              <w:fldChar w:fldCharType="begin"/>
+            </w:r>
+            <w:r>
+              <w:instrText xml:space="preserve">PAGEREF _Toc807765269 \h</w:instrText>
+            </w:r>
+            <w:r>
+              <w:fldChar w:fldCharType="separate"/>
+            </w:r>
+            <w:r>
+              <w:rPr>
+                <w:rStyle w:val="Hyperlink"/>
+              </w:rPr>
+              <w:t>8</w:t>
+            </w:r>
+            <w:r>
+              <w:fldChar w:fldCharType="end"/>
+            </w:r>
+          </w:hyperlink>
+        </w:p>
+        <w:p>
+          <w:pPr>
+            <w:pStyle w:val="TOC2"/>
+            <w:tabs>
+              <w:tab w:val="right" w:leader="dot" w:pos="9735"/>
+            </w:tabs>
+            <w:bidi w:val="0"/>
+            <w:rPr>
+              <w:rStyle w:val="Hyperlink"/>
+            </w:rPr>
+          </w:pPr>
+          <w:hyperlink w:anchor="_Toc830539960">
+            <w:r>
+              <w:rPr>
+                <w:rStyle w:val="Hyperlink"/>
+              </w:rPr>
+              <w:t>3.3.2 Evolutionary Neural Architecture Search</w:t>
+            </w:r>
+            <w:r>
+              <w:tab/>
+            </w:r>
+            <w:r>
+              <w:fldChar w:fldCharType="begin"/>
+            </w:r>
+            <w:r>
+              <w:instrText xml:space="preserve">PAGEREF _Toc830539960 \h</w:instrText>
+            </w:r>
+            <w:r>
+              <w:fldChar w:fldCharType="separate"/>
+            </w:r>
+            <w:r>
+              <w:rPr>
+                <w:rStyle w:val="Hyperlink"/>
+              </w:rPr>
+              <w:t>8</w:t>
+            </w:r>
+            <w:r>
+              <w:fldChar w:fldCharType="end"/>
+            </w:r>
+          </w:hyperlink>
+        </w:p>
+        <w:p>
+          <w:pPr>
+            <w:pStyle w:val="TOC2"/>
+            <w:tabs>
+              <w:tab w:val="right" w:leader="dot" w:pos="9735"/>
+            </w:tabs>
+            <w:bidi w:val="0"/>
+            <w:rPr>
+              <w:rStyle w:val="Hyperlink"/>
+            </w:rPr>
+          </w:pPr>
+          <w:hyperlink w:anchor="_Toc1200992875">
+            <w:r>
+              <w:rPr>
+                <w:rStyle w:val="Hyperlink"/>
+              </w:rPr>
+              <w:t>3.3.3 Tree Search and Sample-Efficient Search</w:t>
+            </w:r>
+            <w:r>
+              <w:tab/>
+            </w:r>
+            <w:r>
+              <w:fldChar w:fldCharType="begin"/>
+            </w:r>
+            <w:r>
+              <w:instrText xml:space="preserve">PAGEREF _Toc1200992875 \h</w:instrText>
+            </w:r>
+            <w:r>
+              <w:fldChar w:fldCharType="separate"/>
+            </w:r>
+            <w:r>
+              <w:rPr>
+                <w:rStyle w:val="Hyperlink"/>
+              </w:rPr>
+              <w:t>8</w:t>
+            </w:r>
+            <w:r>
+              <w:fldChar w:fldCharType="end"/>
+            </w:r>
+          </w:hyperlink>
+        </w:p>
+        <w:p>
+          <w:pPr>
+            <w:pStyle w:val="TOC2"/>
+            <w:tabs>
+              <w:tab w:val="right" w:leader="dot" w:pos="9735"/>
+            </w:tabs>
+            <w:bidi w:val="0"/>
+            <w:rPr>
+              <w:rStyle w:val="Hyperlink"/>
+            </w:rPr>
+          </w:pPr>
+          <w:hyperlink w:anchor="_Toc1444872228">
+            <w:r>
+              <w:rPr>
+                <w:rStyle w:val="Hyperlink"/>
+              </w:rPr>
+              <w:t>3.3.4 Comparative Analysis of Classical NAS</w:t>
+            </w:r>
+            <w:r>
+              <w:tab/>
+            </w:r>
+            <w:r>
+              <w:fldChar w:fldCharType="begin"/>
+            </w:r>
+            <w:r>
+              <w:instrText xml:space="preserve">PAGEREF _Toc1444872228 \h</w:instrText>
+            </w:r>
+            <w:r>
+              <w:fldChar w:fldCharType="separate"/>
+            </w:r>
+            <w:r>
+              <w:rPr>
+                <w:rStyle w:val="Hyperlink"/>
+              </w:rPr>
+              <w:t>9</w:t>
+            </w:r>
+            <w:r>
+              <w:fldChar w:fldCharType="end"/>
+            </w:r>
+          </w:hyperlink>
+        </w:p>
+        <w:p>
+          <w:pPr>
+            <w:pStyle w:val="TOC4"/>
+            <w:tabs>
+              <w:tab w:val="right" w:leader="dot" w:pos="9735"/>
+            </w:tabs>
+            <w:bidi w:val="0"/>
+            <w:rPr>
+              <w:rStyle w:val="Hyperlink"/>
+            </w:rPr>
+          </w:pPr>
+          <w:hyperlink w:anchor="_Toc1090721016">
+            <w:r>
+              <w:rPr>
+                <w:rStyle w:val="Hyperlink"/>
+              </w:rPr>
+              <w:t>Table 01: Comparison of Classical NAS Paradigms</w:t>
+            </w:r>
+            <w:r>
+              <w:tab/>
+            </w:r>
+            <w:r>
+              <w:fldChar w:fldCharType="begin"/>
+            </w:r>
+            <w:r>
+              <w:instrText xml:space="preserve">PAGEREF _Toc1090721016 \h</w:instrText>
+            </w:r>
+            <w:r>
+              <w:fldChar w:fldCharType="separate"/>
+            </w:r>
+            <w:r>
+              <w:rPr>
+                <w:rStyle w:val="Hyperlink"/>
+              </w:rPr>
+              <w:t>9</w:t>
+            </w:r>
+            <w:r>
+              <w:fldChar w:fldCharType="end"/>
+            </w:r>
+          </w:hyperlink>
+        </w:p>
+        <w:p>
+          <w:pPr>
+            <w:pStyle w:val="TOC2"/>
+            <w:tabs>
+              <w:tab w:val="right" w:leader="dot" w:pos="9735"/>
+            </w:tabs>
+            <w:bidi w:val="0"/>
+            <w:rPr>
+              <w:rStyle w:val="Hyperlink"/>
+            </w:rPr>
+          </w:pPr>
+          <w:hyperlink w:anchor="_Toc1459361674">
+            <w:r>
+              <w:rPr>
+                <w:rStyle w:val="Hyperlink"/>
+              </w:rPr>
+              <w:t>3.4 Efficiency-Oriented NAS</w:t>
+            </w:r>
+            <w:r>
+              <w:tab/>
+            </w:r>
+            <w:r>
+              <w:fldChar w:fldCharType="begin"/>
+            </w:r>
+            <w:r>
+              <w:instrText xml:space="preserve">PAGEREF _Toc1459361674 \h</w:instrText>
+            </w:r>
+            <w:r>
+              <w:fldChar w:fldCharType="separate"/>
+            </w:r>
+            <w:r>
+              <w:rPr>
+                <w:rStyle w:val="Hyperlink"/>
+              </w:rPr>
+              <w:t>9</w:t>
+            </w:r>
+            <w:r>
+              <w:fldChar w:fldCharType="end"/>
+            </w:r>
+          </w:hyperlink>
+        </w:p>
+        <w:p>
+          <w:pPr>
+            <w:pStyle w:val="TOC2"/>
+            <w:tabs>
+              <w:tab w:val="right" w:leader="dot" w:pos="9735"/>
+            </w:tabs>
+            <w:bidi w:val="0"/>
+            <w:rPr>
+              <w:rStyle w:val="Hyperlink"/>
+            </w:rPr>
+          </w:pPr>
+          <w:hyperlink w:anchor="_Toc612022560">
+            <w:r>
+              <w:rPr>
+                <w:rStyle w:val="Hyperlink"/>
+              </w:rPr>
+              <w:t>3.4.1 Differentiable Neural Architecture Search</w:t>
+            </w:r>
+            <w:r>
+              <w:tab/>
+            </w:r>
+            <w:r>
+              <w:fldChar w:fldCharType="begin"/>
+            </w:r>
+            <w:r>
+              <w:instrText xml:space="preserve">PAGEREF _Toc612022560 \h</w:instrText>
+            </w:r>
+            <w:r>
+              <w:fldChar w:fldCharType="separate"/>
+            </w:r>
+            <w:r>
+              <w:rPr>
+                <w:rStyle w:val="Hyperlink"/>
+              </w:rPr>
+              <w:t>10</w:t>
+            </w:r>
+            <w:r>
+              <w:fldChar w:fldCharType="end"/>
+            </w:r>
+          </w:hyperlink>
+        </w:p>
+        <w:p>
+          <w:pPr>
+            <w:pStyle w:val="TOC2"/>
+            <w:tabs>
+              <w:tab w:val="right" w:leader="dot" w:pos="9735"/>
+            </w:tabs>
+            <w:bidi w:val="0"/>
+            <w:rPr>
+              <w:rStyle w:val="Hyperlink"/>
+            </w:rPr>
+          </w:pPr>
+          <w:hyperlink w:anchor="_Toc2102214826">
+            <w:r>
+              <w:rPr>
+                <w:rStyle w:val="Hyperlink"/>
+              </w:rPr>
+              <w:t>3.4.2 One-Shot and Weight-Sharing NAS</w:t>
+            </w:r>
+            <w:r>
+              <w:tab/>
+            </w:r>
+            <w:r>
+              <w:fldChar w:fldCharType="begin"/>
+            </w:r>
+            <w:r>
+              <w:instrText xml:space="preserve">PAGEREF _Toc2102214826 \h</w:instrText>
+            </w:r>
+            <w:r>
+              <w:fldChar w:fldCharType="separate"/>
+            </w:r>
+            <w:r>
+              <w:rPr>
+                <w:rStyle w:val="Hyperlink"/>
+              </w:rPr>
+              <w:t>10</w:t>
+            </w:r>
+            <w:r>
+              <w:fldChar w:fldCharType="end"/>
+            </w:r>
+          </w:hyperlink>
+        </w:p>
+        <w:p>
+          <w:pPr>
+            <w:pStyle w:val="TOC2"/>
+            <w:tabs>
+              <w:tab w:val="right" w:leader="dot" w:pos="9735"/>
+            </w:tabs>
+            <w:bidi w:val="0"/>
+            <w:rPr>
+              <w:rStyle w:val="Hyperlink"/>
+            </w:rPr>
+          </w:pPr>
+          <w:hyperlink w:anchor="_Toc1434987779">
+            <w:r>
+              <w:rPr>
+                <w:rStyle w:val="Hyperlink"/>
+              </w:rPr>
+              <w:t>3.4.3 Hardware-Aware and Sustainable NAS</w:t>
+            </w:r>
+            <w:r>
+              <w:tab/>
+            </w:r>
+            <w:r>
+              <w:fldChar w:fldCharType="begin"/>
+            </w:r>
+            <w:r>
+              <w:instrText xml:space="preserve">PAGEREF _Toc1434987779 \h</w:instrText>
+            </w:r>
+            <w:r>
+              <w:fldChar w:fldCharType="separate"/>
+            </w:r>
+            <w:r>
+              <w:rPr>
+                <w:rStyle w:val="Hyperlink"/>
+              </w:rPr>
+              <w:t>10</w:t>
+            </w:r>
+            <w:r>
+              <w:fldChar w:fldCharType="end"/>
+            </w:r>
+          </w:hyperlink>
+        </w:p>
+        <w:p>
+          <w:pPr>
+            <w:pStyle w:val="TOC2"/>
+            <w:tabs>
+              <w:tab w:val="right" w:leader="dot" w:pos="9735"/>
+            </w:tabs>
+            <w:bidi w:val="0"/>
+            <w:rPr>
+              <w:rStyle w:val="Hyperlink"/>
+            </w:rPr>
+          </w:pPr>
+          <w:hyperlink w:anchor="_Toc150261818">
+            <w:r>
+              <w:rPr>
+                <w:rStyle w:val="Hyperlink"/>
+              </w:rPr>
+              <w:t>3.4.4 Comparative Analysis of Efficiency-Oriented NAS</w:t>
+            </w:r>
+            <w:r>
+              <w:tab/>
+            </w:r>
+            <w:r>
+              <w:fldChar w:fldCharType="begin"/>
+            </w:r>
+            <w:r>
+              <w:instrText xml:space="preserve">PAGEREF _Toc150261818 \h</w:instrText>
+            </w:r>
+            <w:r>
+              <w:fldChar w:fldCharType="separate"/>
+            </w:r>
+            <w:r>
+              <w:rPr>
+                <w:rStyle w:val="Hyperlink"/>
+              </w:rPr>
+              <w:t>11</w:t>
+            </w:r>
+            <w:r>
+              <w:fldChar w:fldCharType="end"/>
+            </w:r>
+          </w:hyperlink>
+        </w:p>
+        <w:p>
+          <w:pPr>
+            <w:pStyle w:val="TOC4"/>
+            <w:tabs>
+              <w:tab w:val="right" w:leader="dot" w:pos="9735"/>
+            </w:tabs>
+            <w:bidi w:val="0"/>
+            <w:rPr>
+              <w:rStyle w:val="Hyperlink"/>
+            </w:rPr>
+          </w:pPr>
+          <w:hyperlink w:anchor="_Toc359091427">
+            <w:r>
+              <w:rPr>
+                <w:rStyle w:val="Hyperlink"/>
+              </w:rPr>
+              <w:t>Table 02: Comparison of Efficiency-Oriented NAS Methods</w:t>
+            </w:r>
+            <w:r>
+              <w:tab/>
+            </w:r>
+            <w:r>
+              <w:fldChar w:fldCharType="begin"/>
+            </w:r>
+            <w:r>
+              <w:instrText xml:space="preserve">PAGEREF _Toc359091427 \h</w:instrText>
+            </w:r>
+            <w:r>
+              <w:fldChar w:fldCharType="separate"/>
+            </w:r>
+            <w:r>
+              <w:rPr>
+                <w:rStyle w:val="Hyperlink"/>
+              </w:rPr>
+              <w:t>11</w:t>
+            </w:r>
+            <w:r>
+              <w:fldChar w:fldCharType="end"/>
+            </w:r>
+          </w:hyperlink>
+        </w:p>
+        <w:p>
+          <w:pPr>
+            <w:pStyle w:val="TOC2"/>
+            <w:tabs>
+              <w:tab w:val="right" w:leader="dot" w:pos="9735"/>
+            </w:tabs>
+            <w:bidi w:val="0"/>
+            <w:rPr>
+              <w:rStyle w:val="Hyperlink"/>
+            </w:rPr>
+          </w:pPr>
+          <w:hyperlink w:anchor="_Toc1423345974">
+            <w:r>
+              <w:rPr>
+                <w:rStyle w:val="Hyperlink"/>
+              </w:rPr>
+              <w:t>3.5 Toward Autonomous NAS</w:t>
+            </w:r>
+            <w:r>
+              <w:tab/>
+            </w:r>
+            <w:r>
+              <w:fldChar w:fldCharType="begin"/>
+            </w:r>
+            <w:r>
+              <w:instrText xml:space="preserve">PAGEREF _Toc1423345974 \h</w:instrText>
+            </w:r>
+            <w:r>
+              <w:fldChar w:fldCharType="separate"/>
+            </w:r>
+            <w:r>
+              <w:rPr>
+                <w:rStyle w:val="Hyperlink"/>
+              </w:rPr>
+              <w:t>11</w:t>
+            </w:r>
+            <w:r>
+              <w:fldChar w:fldCharType="end"/>
+            </w:r>
+          </w:hyperlink>
+        </w:p>
+        <w:p>
+          <w:pPr>
+            <w:pStyle w:val="TOC2"/>
+            <w:tabs>
+              <w:tab w:val="right" w:leader="dot" w:pos="9735"/>
+            </w:tabs>
+            <w:bidi w:val="0"/>
+            <w:rPr>
+              <w:rStyle w:val="Hyperlink"/>
+            </w:rPr>
+          </w:pPr>
+          <w:hyperlink w:anchor="_Toc1705128688">
+            <w:r>
+              <w:rPr>
+                <w:rStyle w:val="Hyperlink"/>
+              </w:rPr>
+              <w:t>3.6 Research Gap and Positioning of Proposed Framework</w:t>
+            </w:r>
+            <w:r>
+              <w:tab/>
+            </w:r>
+            <w:r>
+              <w:fldChar w:fldCharType="begin"/>
+            </w:r>
+            <w:r>
+              <w:instrText xml:space="preserve">PAGEREF _Toc1705128688 \h</w:instrText>
+            </w:r>
+            <w:r>
+              <w:fldChar w:fldCharType="separate"/>
+            </w:r>
+            <w:r>
+              <w:rPr>
+                <w:rStyle w:val="Hyperlink"/>
+              </w:rPr>
+              <w:t>13</w:t>
+            </w:r>
+            <w:r>
+              <w:fldChar w:fldCharType="end"/>
+            </w:r>
+          </w:hyperlink>
+        </w:p>
+        <w:p>
+          <w:pPr>
+            <w:pStyle w:val="TOC4"/>
+            <w:tabs>
+              <w:tab w:val="right" w:leader="dot" w:pos="9735"/>
+            </w:tabs>
+            <w:bidi w:val="0"/>
+            <w:rPr>
+              <w:rStyle w:val="Hyperlink"/>
+            </w:rPr>
+          </w:pPr>
+          <w:hyperlink w:anchor="_Toc996424859">
+            <w:r>
+              <w:rPr>
+                <w:rStyle w:val="Hyperlink"/>
+              </w:rPr>
+              <w:t>Table 03: Positioning of the Proposed Framework</w:t>
+            </w:r>
+            <w:r>
+              <w:tab/>
+            </w:r>
+            <w:r>
+              <w:fldChar w:fldCharType="begin"/>
+            </w:r>
+            <w:r>
+              <w:instrText xml:space="preserve">PAGEREF _Toc996424859 \h</w:instrText>
+            </w:r>
+            <w:r>
+              <w:fldChar w:fldCharType="separate"/>
+            </w:r>
+            <w:r>
+              <w:rPr>
+                <w:rStyle w:val="Hyperlink"/>
+              </w:rPr>
+              <w:t>14</w:t>
+            </w:r>
+            <w:r>
+              <w:fldChar w:fldCharType="end"/>
+            </w:r>
+          </w:hyperlink>
+        </w:p>
+        <w:p>
+          <w:pPr>
+            <w:pStyle w:val="TOC1"/>
+            <w:tabs>
+              <w:tab w:val="right" w:leader="dot" w:pos="9735"/>
+            </w:tabs>
+            <w:bidi w:val="0"/>
+            <w:rPr>
+              <w:rStyle w:val="Hyperlink"/>
+            </w:rPr>
+          </w:pPr>
+          <w:hyperlink w:anchor="_Toc732946639">
+            <w:r>
+              <w:rPr>
+                <w:rStyle w:val="Hyperlink"/>
+              </w:rPr>
+              <w:t>4. Methodology and System Design</w:t>
+            </w:r>
+            <w:r>
+              <w:tab/>
+            </w:r>
+            <w:r>
+              <w:fldChar w:fldCharType="begin"/>
+            </w:r>
+            <w:r>
+              <w:instrText xml:space="preserve">PAGEREF _Toc732946639 \h</w:instrText>
+            </w:r>
+            <w:r>
+              <w:fldChar w:fldCharType="separate"/>
+            </w:r>
+            <w:r>
+              <w:rPr>
+                <w:rStyle w:val="Hyperlink"/>
+              </w:rPr>
+              <w:t>14</w:t>
+            </w:r>
+            <w:r>
+              <w:fldChar w:fldCharType="end"/>
+            </w:r>
+          </w:hyperlink>
+        </w:p>
+        <w:p>
+          <w:pPr>
+            <w:pStyle w:val="TOC2"/>
+            <w:tabs>
+              <w:tab w:val="right" w:leader="dot" w:pos="9735"/>
+            </w:tabs>
+            <w:bidi w:val="0"/>
+            <w:rPr>
+              <w:rStyle w:val="Hyperlink"/>
+            </w:rPr>
+          </w:pPr>
+          <w:hyperlink w:anchor="_Toc5228534">
+            <w:r>
+              <w:rPr>
+                <w:rStyle w:val="Hyperlink"/>
+              </w:rPr>
+              <w:t>4.1 Research Design</w:t>
+            </w:r>
+            <w:r>
+              <w:tab/>
+            </w:r>
+            <w:r>
+              <w:fldChar w:fldCharType="begin"/>
+            </w:r>
+            <w:r>
+              <w:instrText xml:space="preserve">PAGEREF _Toc5228534 \h</w:instrText>
+            </w:r>
+            <w:r>
+              <w:fldChar w:fldCharType="separate"/>
+            </w:r>
+            <w:r>
+              <w:rPr>
+                <w:rStyle w:val="Hyperlink"/>
+              </w:rPr>
+              <w:t>14</w:t>
+            </w:r>
+            <w:r>
+              <w:fldChar w:fldCharType="end"/>
+            </w:r>
+          </w:hyperlink>
+        </w:p>
+        <w:p>
+          <w:pPr>
+            <w:pStyle w:val="TOC2"/>
+            <w:tabs>
+              <w:tab w:val="right" w:leader="dot" w:pos="9735"/>
+            </w:tabs>
+            <w:bidi w:val="0"/>
+            <w:rPr>
+              <w:rStyle w:val="Hyperlink"/>
+            </w:rPr>
+          </w:pPr>
+          <w:hyperlink w:anchor="_Toc1455901423">
+            <w:r>
+              <w:rPr>
+                <w:rStyle w:val="Hyperlink"/>
+              </w:rPr>
+              <w:t>4.2 System Architecture Overview</w:t>
+            </w:r>
+            <w:r>
+              <w:tab/>
+            </w:r>
+            <w:r>
+              <w:fldChar w:fldCharType="begin"/>
+            </w:r>
+            <w:r>
+              <w:instrText xml:space="preserve">PAGEREF _Toc1455901423 \h</w:instrText>
+            </w:r>
+            <w:r>
+              <w:fldChar w:fldCharType="separate"/>
+            </w:r>
+            <w:r>
+              <w:rPr>
+                <w:rStyle w:val="Hyperlink"/>
+              </w:rPr>
+              <w:t>15</w:t>
+            </w:r>
+            <w:r>
+              <w:fldChar w:fldCharType="end"/>
+            </w:r>
+          </w:hyperlink>
+        </w:p>
+        <w:p>
+          <w:pPr>
+            <w:pStyle w:val="TOC4"/>
+            <w:tabs>
+              <w:tab w:val="right" w:leader="dot" w:pos="9735"/>
+            </w:tabs>
+            <w:bidi w:val="0"/>
+            <w:rPr>
+              <w:rStyle w:val="Hyperlink"/>
+            </w:rPr>
+          </w:pPr>
+          <w:hyperlink w:anchor="_Toc1745144943">
+            <w:r>
+              <w:rPr>
+                <w:rStyle w:val="Hyperlink"/>
+              </w:rPr>
+              <w:t>Diagram 01: Pipeline architecture of the proposed Agentic NAS framework</w:t>
+            </w:r>
+            <w:r>
+              <w:tab/>
+            </w:r>
+            <w:r>
+              <w:fldChar w:fldCharType="begin"/>
+            </w:r>
+            <w:r>
+              <w:instrText xml:space="preserve">PAGEREF _Toc1745144943 \h</w:instrText>
+            </w:r>
+            <w:r>
+              <w:fldChar w:fldCharType="separate"/>
+            </w:r>
+            <w:r>
+              <w:rPr>
+                <w:rStyle w:val="Hyperlink"/>
+              </w:rPr>
+              <w:t>15</w:t>
+            </w:r>
+            <w:r>
+              <w:fldChar w:fldCharType="end"/>
+            </w:r>
+          </w:hyperlink>
+        </w:p>
+        <w:p>
+          <w:pPr>
+            <w:pStyle w:val="TOC2"/>
+            <w:tabs>
+              <w:tab w:val="right" w:leader="dot" w:pos="9735"/>
+            </w:tabs>
+            <w:bidi w:val="0"/>
+            <w:rPr>
+              <w:rStyle w:val="Hyperlink"/>
+            </w:rPr>
+          </w:pPr>
+          <w:hyperlink w:anchor="_Toc653213416">
+            <w:r>
+              <w:rPr>
+                <w:rStyle w:val="Hyperlink"/>
+              </w:rPr>
+              <w:t>4.3 Agent Roles and Responsibilities</w:t>
+            </w:r>
+            <w:r>
+              <w:tab/>
+            </w:r>
+            <w:r>
+              <w:fldChar w:fldCharType="begin"/>
+            </w:r>
+            <w:r>
+              <w:instrText xml:space="preserve">PAGEREF _Toc653213416 \h</w:instrText>
+            </w:r>
+            <w:r>
+              <w:fldChar w:fldCharType="separate"/>
+            </w:r>
+            <w:r>
+              <w:rPr>
+                <w:rStyle w:val="Hyperlink"/>
+              </w:rPr>
+              <w:t>17</w:t>
+            </w:r>
+            <w:r>
+              <w:fldChar w:fldCharType="end"/>
+            </w:r>
+          </w:hyperlink>
+        </w:p>
+        <w:p>
+          <w:pPr>
+            <w:pStyle w:val="TOC4"/>
+            <w:tabs>
+              <w:tab w:val="right" w:leader="dot" w:pos="9735"/>
+            </w:tabs>
+            <w:bidi w:val="0"/>
+            <w:rPr>
+              <w:rStyle w:val="Hyperlink"/>
+            </w:rPr>
+          </w:pPr>
+          <w:hyperlink w:anchor="_Toc239784296">
+            <w:r>
+              <w:rPr>
+                <w:rStyle w:val="Hyperlink"/>
+              </w:rPr>
+              <w:t>Figure 2: NAS Agents crew</w:t>
+            </w:r>
+            <w:r>
+              <w:tab/>
+            </w:r>
+            <w:r>
+              <w:fldChar w:fldCharType="begin"/>
+            </w:r>
+            <w:r>
+              <w:instrText xml:space="preserve">PAGEREF _Toc239784296 \h</w:instrText>
+            </w:r>
+            <w:r>
+              <w:fldChar w:fldCharType="separate"/>
+            </w:r>
+            <w:r>
+              <w:rPr>
+                <w:rStyle w:val="Hyperlink"/>
+              </w:rPr>
+              <w:t>17</w:t>
+            </w:r>
+            <w:r>
+              <w:fldChar w:fldCharType="end"/>
+            </w:r>
+          </w:hyperlink>
+        </w:p>
+        <w:p>
+          <w:pPr>
+            <w:pStyle w:val="TOC2"/>
+            <w:tabs>
+              <w:tab w:val="right" w:leader="dot" w:pos="9735"/>
+            </w:tabs>
+            <w:bidi w:val="0"/>
+            <w:rPr>
+              <w:rStyle w:val="Hyperlink"/>
+            </w:rPr>
+          </w:pPr>
+          <w:hyperlink w:anchor="_Toc2100390308">
+            <w:r>
+              <w:rPr>
+                <w:rStyle w:val="Hyperlink"/>
+              </w:rPr>
+              <w:t>4.3.1 Profiler Agent</w:t>
+            </w:r>
+            <w:r>
+              <w:tab/>
+            </w:r>
+            <w:r>
+              <w:fldChar w:fldCharType="begin"/>
+            </w:r>
+            <w:r>
+              <w:instrText xml:space="preserve">PAGEREF _Toc2100390308 \h</w:instrText>
+            </w:r>
+            <w:r>
+              <w:fldChar w:fldCharType="separate"/>
+            </w:r>
+            <w:r>
+              <w:rPr>
+                <w:rStyle w:val="Hyperlink"/>
+              </w:rPr>
+              <w:t>18</w:t>
+            </w:r>
+            <w:r>
+              <w:fldChar w:fldCharType="end"/>
+            </w:r>
+          </w:hyperlink>
+        </w:p>
+        <w:p>
+          <w:pPr>
+            <w:pStyle w:val="TOC2"/>
+            <w:tabs>
+              <w:tab w:val="right" w:leader="dot" w:pos="9735"/>
+            </w:tabs>
+            <w:bidi w:val="0"/>
+            <w:rPr>
+              <w:rStyle w:val="Hyperlink"/>
+            </w:rPr>
+          </w:pPr>
+          <w:hyperlink w:anchor="_Toc1933694693">
+            <w:r>
+              <w:rPr>
+                <w:rStyle w:val="Hyperlink"/>
+              </w:rPr>
+              <w:t>4.3.2 Builder Agent</w:t>
+            </w:r>
+            <w:r>
+              <w:tab/>
+            </w:r>
+            <w:r>
+              <w:fldChar w:fldCharType="begin"/>
+            </w:r>
+            <w:r>
+              <w:instrText xml:space="preserve">PAGEREF _Toc1933694693 \h</w:instrText>
+            </w:r>
+            <w:r>
+              <w:fldChar w:fldCharType="separate"/>
+            </w:r>
+            <w:r>
+              <w:rPr>
+                <w:rStyle w:val="Hyperlink"/>
+              </w:rPr>
+              <w:t>18</w:t>
+            </w:r>
+            <w:r>
+              <w:fldChar w:fldCharType="end"/>
+            </w:r>
+          </w:hyperlink>
+        </w:p>
+        <w:p>
+          <w:pPr>
+            <w:pStyle w:val="TOC2"/>
+            <w:tabs>
+              <w:tab w:val="right" w:leader="dot" w:pos="9735"/>
+            </w:tabs>
+            <w:bidi w:val="0"/>
+            <w:rPr>
+              <w:rStyle w:val="Hyperlink"/>
+            </w:rPr>
+          </w:pPr>
+          <w:hyperlink w:anchor="_Toc1063422200">
+            <w:r>
+              <w:rPr>
+                <w:rStyle w:val="Hyperlink"/>
+              </w:rPr>
+              <w:t>4.3.3 Trainer Agent</w:t>
+            </w:r>
+            <w:r>
+              <w:tab/>
+            </w:r>
+            <w:r>
+              <w:fldChar w:fldCharType="begin"/>
+            </w:r>
+            <w:r>
+              <w:instrText xml:space="preserve">PAGEREF _Toc1063422200 \h</w:instrText>
+            </w:r>
+            <w:r>
+              <w:fldChar w:fldCharType="separate"/>
+            </w:r>
+            <w:r>
+              <w:rPr>
+                <w:rStyle w:val="Hyperlink"/>
+              </w:rPr>
+              <w:t>19</w:t>
+            </w:r>
+            <w:r>
+              <w:fldChar w:fldCharType="end"/>
+            </w:r>
+          </w:hyperlink>
+        </w:p>
+        <w:p>
+          <w:pPr>
+            <w:pStyle w:val="TOC2"/>
+            <w:tabs>
+              <w:tab w:val="right" w:leader="dot" w:pos="9735"/>
+            </w:tabs>
+            <w:bidi w:val="0"/>
+            <w:rPr>
+              <w:rStyle w:val="Hyperlink"/>
+            </w:rPr>
+          </w:pPr>
+          <w:hyperlink w:anchor="_Toc240581063">
+            <w:r>
+              <w:rPr>
+                <w:rStyle w:val="Hyperlink"/>
+              </w:rPr>
+              <w:t>4.3.4 Evaluator Agent</w:t>
+            </w:r>
+            <w:r>
+              <w:tab/>
+            </w:r>
+            <w:r>
+              <w:fldChar w:fldCharType="begin"/>
+            </w:r>
+            <w:r>
+              <w:instrText xml:space="preserve">PAGEREF _Toc240581063 \h</w:instrText>
+            </w:r>
+            <w:r>
+              <w:fldChar w:fldCharType="separate"/>
+            </w:r>
+            <w:r>
+              <w:rPr>
+                <w:rStyle w:val="Hyperlink"/>
+              </w:rPr>
+              <w:t>19</w:t>
+            </w:r>
+            <w:r>
+              <w:fldChar w:fldCharType="end"/>
+            </w:r>
+          </w:hyperlink>
+        </w:p>
+        <w:p>
+          <w:pPr>
+            <w:pStyle w:val="TOC2"/>
+            <w:tabs>
+              <w:tab w:val="right" w:leader="dot" w:pos="9735"/>
+            </w:tabs>
+            <w:bidi w:val="0"/>
+            <w:rPr>
+              <w:rStyle w:val="Hyperlink"/>
+            </w:rPr>
+          </w:pPr>
+          <w:hyperlink w:anchor="_Toc1573395501">
+            <w:r>
+              <w:rPr>
+                <w:rStyle w:val="Hyperlink"/>
+              </w:rPr>
+              <w:t>4.3.5 Reporter Agent</w:t>
+            </w:r>
+            <w:r>
+              <w:tab/>
+            </w:r>
+            <w:r>
+              <w:fldChar w:fldCharType="begin"/>
+            </w:r>
+            <w:r>
+              <w:instrText xml:space="preserve">PAGEREF _Toc1573395501 \h</w:instrText>
+            </w:r>
+            <w:r>
+              <w:fldChar w:fldCharType="separate"/>
+            </w:r>
+            <w:r>
+              <w:rPr>
+                <w:rStyle w:val="Hyperlink"/>
+              </w:rPr>
+              <w:t>19</w:t>
+            </w:r>
+            <w:r>
+              <w:fldChar w:fldCharType="end"/>
+            </w:r>
+          </w:hyperlink>
+        </w:p>
+        <w:p>
+          <w:pPr>
+            <w:pStyle w:val="TOC2"/>
+            <w:tabs>
+              <w:tab w:val="right" w:leader="dot" w:pos="9735"/>
+            </w:tabs>
+            <w:bidi w:val="0"/>
+            <w:rPr>
+              <w:rStyle w:val="Hyperlink"/>
+            </w:rPr>
+          </w:pPr>
+          <w:hyperlink w:anchor="_Toc1326775627">
+            <w:r>
+              <w:rPr>
+                <w:rStyle w:val="Hyperlink"/>
+              </w:rPr>
+              <w:t>4.3.6 Inter-Agent Contracts and Separation of Concerns</w:t>
+            </w:r>
+            <w:r>
+              <w:tab/>
+            </w:r>
+            <w:r>
+              <w:fldChar w:fldCharType="begin"/>
+            </w:r>
+            <w:r>
+              <w:instrText xml:space="preserve">PAGEREF _Toc1326775627 \h</w:instrText>
+            </w:r>
+            <w:r>
+              <w:fldChar w:fldCharType="separate"/>
+            </w:r>
+            <w:r>
+              <w:rPr>
+                <w:rStyle w:val="Hyperlink"/>
+              </w:rPr>
+              <w:t>20</w:t>
+            </w:r>
+            <w:r>
+              <w:fldChar w:fldCharType="end"/>
+            </w:r>
+          </w:hyperlink>
+        </w:p>
+        <w:p>
+          <w:pPr>
+            <w:pStyle w:val="TOC2"/>
+            <w:tabs>
+              <w:tab w:val="right" w:leader="dot" w:pos="9735"/>
+            </w:tabs>
+            <w:bidi w:val="0"/>
+            <w:rPr>
+              <w:rStyle w:val="Hyperlink"/>
+            </w:rPr>
+          </w:pPr>
+          <w:hyperlink w:anchor="_Toc2008103138">
+            <w:r>
+              <w:rPr>
+                <w:rStyle w:val="Hyperlink"/>
+              </w:rPr>
+              <w:t>4.4 Orchestration Workflow</w:t>
+            </w:r>
+            <w:r>
+              <w:tab/>
+            </w:r>
+            <w:r>
+              <w:fldChar w:fldCharType="begin"/>
+            </w:r>
+            <w:r>
+              <w:instrText xml:space="preserve">PAGEREF _Toc2008103138 \h</w:instrText>
+            </w:r>
+            <w:r>
+              <w:fldChar w:fldCharType="separate"/>
+            </w:r>
+            <w:r>
+              <w:rPr>
+                <w:rStyle w:val="Hyperlink"/>
+              </w:rPr>
+              <w:t>20</w:t>
+            </w:r>
+            <w:r>
+              <w:fldChar w:fldCharType="end"/>
+            </w:r>
+          </w:hyperlink>
+        </w:p>
+        <w:p>
+          <w:pPr>
+            <w:pStyle w:val="TOC4"/>
+            <w:tabs>
+              <w:tab w:val="right" w:leader="dot" w:pos="9735"/>
+            </w:tabs>
+            <w:bidi w:val="0"/>
+            <w:rPr>
+              <w:rStyle w:val="Hyperlink"/>
+            </w:rPr>
+          </w:pPr>
+          <w:hyperlink w:anchor="_Toc1785549295">
+            <w:r>
+              <w:rPr>
+                <w:rStyle w:val="Hyperlink"/>
+              </w:rPr>
+              <w:t>Diagram 02: Illustration of Neural Architecture Search methods</w:t>
+            </w:r>
+            <w:r>
+              <w:tab/>
+            </w:r>
+            <w:r>
+              <w:fldChar w:fldCharType="begin"/>
+            </w:r>
+            <w:r>
+              <w:instrText xml:space="preserve">PAGEREF _Toc1785549295 \h</w:instrText>
+            </w:r>
+            <w:r>
+              <w:fldChar w:fldCharType="separate"/>
+            </w:r>
+            <w:r>
+              <w:rPr>
+                <w:rStyle w:val="Hyperlink"/>
+              </w:rPr>
+              <w:t>21</w:t>
+            </w:r>
+            <w:r>
+              <w:fldChar w:fldCharType="end"/>
+            </w:r>
+          </w:hyperlink>
+        </w:p>
+        <w:p>
+          <w:pPr>
+            <w:pStyle w:val="TOC2"/>
+            <w:tabs>
+              <w:tab w:val="right" w:leader="dot" w:pos="9735"/>
+            </w:tabs>
+            <w:bidi w:val="0"/>
+            <w:rPr>
+              <w:rStyle w:val="Hyperlink"/>
+            </w:rPr>
+          </w:pPr>
+          <w:hyperlink w:anchor="_Toc207471493">
+            <w:r>
+              <w:rPr>
+                <w:rStyle w:val="Hyperlink"/>
+              </w:rPr>
+              <w:t>4.5 Search and Optimisation Strategy</w:t>
+            </w:r>
+            <w:r>
+              <w:tab/>
+            </w:r>
+            <w:r>
+              <w:fldChar w:fldCharType="begin"/>
+            </w:r>
+            <w:r>
+              <w:instrText xml:space="preserve">PAGEREF _Toc207471493 \h</w:instrText>
+            </w:r>
+            <w:r>
+              <w:fldChar w:fldCharType="separate"/>
+            </w:r>
+            <w:r>
+              <w:rPr>
+                <w:rStyle w:val="Hyperlink"/>
+              </w:rPr>
+              <w:t>21</w:t>
+            </w:r>
+            <w:r>
+              <w:fldChar w:fldCharType="end"/>
+            </w:r>
+          </w:hyperlink>
+        </w:p>
+        <w:p>
+          <w:pPr>
+            <w:pStyle w:val="TOC2"/>
+            <w:tabs>
+              <w:tab w:val="right" w:leader="dot" w:pos="9735"/>
+            </w:tabs>
+            <w:bidi w:val="0"/>
+            <w:rPr>
+              <w:rStyle w:val="Hyperlink"/>
+            </w:rPr>
+          </w:pPr>
+          <w:hyperlink w:anchor="_Toc794912406">
+            <w:r>
+              <w:rPr>
+                <w:rStyle w:val="Hyperlink"/>
+              </w:rPr>
+              <w:t>4.6 Memory, Logging and Artifact Persistence</w:t>
+            </w:r>
+            <w:r>
+              <w:tab/>
+            </w:r>
+            <w:r>
+              <w:fldChar w:fldCharType="begin"/>
+            </w:r>
+            <w:r>
+              <w:instrText xml:space="preserve">PAGEREF _Toc794912406 \h</w:instrText>
+            </w:r>
+            <w:r>
+              <w:fldChar w:fldCharType="separate"/>
+            </w:r>
+            <w:r>
+              <w:rPr>
+                <w:rStyle w:val="Hyperlink"/>
+              </w:rPr>
+              <w:t>23</w:t>
+            </w:r>
+            <w:r>
+              <w:fldChar w:fldCharType="end"/>
+            </w:r>
+          </w:hyperlink>
+        </w:p>
+        <w:p>
+          <w:pPr>
+            <w:pStyle w:val="TOC2"/>
+            <w:tabs>
+              <w:tab w:val="right" w:leader="dot" w:pos="9735"/>
+            </w:tabs>
+            <w:bidi w:val="0"/>
+            <w:rPr>
+              <w:rStyle w:val="Hyperlink"/>
+            </w:rPr>
+          </w:pPr>
+          <w:hyperlink w:anchor="_Toc669814077">
+            <w:r>
+              <w:rPr>
+                <w:rStyle w:val="Hyperlink"/>
+              </w:rPr>
+              <w:t>4.7 Experimental Setup</w:t>
+            </w:r>
+            <w:r>
+              <w:tab/>
+            </w:r>
+            <w:r>
+              <w:fldChar w:fldCharType="begin"/>
+            </w:r>
+            <w:r>
+              <w:instrText xml:space="preserve">PAGEREF _Toc669814077 \h</w:instrText>
+            </w:r>
+            <w:r>
+              <w:fldChar w:fldCharType="separate"/>
+            </w:r>
+            <w:r>
+              <w:rPr>
+                <w:rStyle w:val="Hyperlink"/>
+              </w:rPr>
+              <w:t>24</w:t>
+            </w:r>
+            <w:r>
+              <w:fldChar w:fldCharType="end"/>
+            </w:r>
+          </w:hyperlink>
+        </w:p>
+        <w:p>
+          <w:pPr>
+            <w:pStyle w:val="TOC4"/>
+            <w:tabs>
+              <w:tab w:val="right" w:leader="dot" w:pos="9735"/>
+            </w:tabs>
+            <w:bidi w:val="0"/>
+            <w:rPr>
+              <w:rStyle w:val="Hyperlink"/>
+            </w:rPr>
+          </w:pPr>
+          <w:hyperlink w:anchor="_Toc1881273898">
+            <w:r>
+              <w:rPr>
+                <w:rStyle w:val="Hyperlink"/>
+              </w:rPr>
+              <w:t>Figure 3: Trainer Agent (Optuna) final answer</w:t>
+            </w:r>
+            <w:r>
+              <w:tab/>
+            </w:r>
+            <w:r>
+              <w:fldChar w:fldCharType="begin"/>
+            </w:r>
+            <w:r>
+              <w:instrText xml:space="preserve">PAGEREF _Toc1881273898 \h</w:instrText>
+            </w:r>
+            <w:r>
+              <w:fldChar w:fldCharType="separate"/>
+            </w:r>
+            <w:r>
+              <w:rPr>
+                <w:rStyle w:val="Hyperlink"/>
+              </w:rPr>
+              <w:t>26</w:t>
+            </w:r>
+            <w:r>
+              <w:fldChar w:fldCharType="end"/>
+            </w:r>
+          </w:hyperlink>
+        </w:p>
+        <w:p>
+          <w:pPr>
+            <w:pStyle w:val="TOC2"/>
+            <w:tabs>
+              <w:tab w:val="right" w:leader="dot" w:pos="9735"/>
+            </w:tabs>
+            <w:bidi w:val="0"/>
+            <w:rPr>
+              <w:rStyle w:val="Hyperlink"/>
+            </w:rPr>
+          </w:pPr>
+          <w:hyperlink w:anchor="_Toc689888176">
+            <w:r>
+              <w:rPr>
+                <w:rStyle w:val="Hyperlink"/>
+              </w:rPr>
+              <w:t>4.8 Testing and Validation</w:t>
+            </w:r>
+            <w:r>
+              <w:tab/>
+            </w:r>
+            <w:r>
+              <w:fldChar w:fldCharType="begin"/>
+            </w:r>
+            <w:r>
+              <w:instrText xml:space="preserve">PAGEREF _Toc689888176 \h</w:instrText>
+            </w:r>
+            <w:r>
+              <w:fldChar w:fldCharType="separate"/>
+            </w:r>
+            <w:r>
+              <w:rPr>
+                <w:rStyle w:val="Hyperlink"/>
+              </w:rPr>
+              <w:t>26</w:t>
+            </w:r>
+            <w:r>
+              <w:fldChar w:fldCharType="end"/>
+            </w:r>
+          </w:hyperlink>
+        </w:p>
+        <w:p>
+          <w:pPr>
+            <w:pStyle w:val="TOC4"/>
+            <w:tabs>
+              <w:tab w:val="right" w:leader="dot" w:pos="9735"/>
+            </w:tabs>
+            <w:bidi w:val="0"/>
+            <w:rPr>
+              <w:rStyle w:val="Hyperlink"/>
+            </w:rPr>
+          </w:pPr>
+          <w:hyperlink w:anchor="_Toc649964564">
+            <w:r>
+              <w:rPr>
+                <w:rStyle w:val="Hyperlink"/>
+              </w:rPr>
+              <w:t>Figure 4: Automated validation of the Agentic NAS framework using pytest.</w:t>
+            </w:r>
+            <w:r>
+              <w:tab/>
+            </w:r>
+            <w:r>
+              <w:fldChar w:fldCharType="begin"/>
+            </w:r>
+            <w:r>
+              <w:instrText xml:space="preserve">PAGEREF _Toc649964564 \h</w:instrText>
+            </w:r>
+            <w:r>
+              <w:fldChar w:fldCharType="separate"/>
+            </w:r>
+            <w:r>
+              <w:rPr>
+                <w:rStyle w:val="Hyperlink"/>
+              </w:rPr>
+              <w:t>27</w:t>
+            </w:r>
+            <w:r>
+              <w:fldChar w:fldCharType="end"/>
+            </w:r>
+          </w:hyperlink>
+        </w:p>
+        <w:p>
+          <w:pPr>
+            <w:pStyle w:val="TOC1"/>
+            <w:tabs>
+              <w:tab w:val="right" w:leader="dot" w:pos="9735"/>
+            </w:tabs>
+            <w:bidi w:val="0"/>
+            <w:rPr>
+              <w:rStyle w:val="Hyperlink"/>
+            </w:rPr>
+          </w:pPr>
+          <w:hyperlink w:anchor="_Toc1455137770">
+            <w:r>
+              <w:rPr>
+                <w:rStyle w:val="Hyperlink"/>
+              </w:rPr>
+              <w:t>5. Results and Discussion</w:t>
+            </w:r>
+            <w:r>
+              <w:tab/>
+            </w:r>
+            <w:r>
+              <w:fldChar w:fldCharType="begin"/>
+            </w:r>
+            <w:r>
+              <w:instrText xml:space="preserve">PAGEREF _Toc1455137770 \h</w:instrText>
+            </w:r>
+            <w:r>
+              <w:fldChar w:fldCharType="separate"/>
+            </w:r>
+            <w:r>
+              <w:rPr>
+                <w:rStyle w:val="Hyperlink"/>
+              </w:rPr>
+              <w:t>28</w:t>
+            </w:r>
+            <w:r>
+              <w:fldChar w:fldCharType="end"/>
+            </w:r>
+          </w:hyperlink>
+        </w:p>
+        <w:p>
+          <w:pPr>
+            <w:pStyle w:val="TOC2"/>
+            <w:tabs>
+              <w:tab w:val="right" w:leader="dot" w:pos="9735"/>
+            </w:tabs>
+            <w:bidi w:val="0"/>
+            <w:rPr>
+              <w:rStyle w:val="Hyperlink"/>
+            </w:rPr>
+          </w:pPr>
+          <w:hyperlink w:anchor="_Toc443620057">
+            <w:r>
+              <w:rPr>
+                <w:rStyle w:val="Hyperlink"/>
+              </w:rPr>
+              <w:t>5.1 Pipeline Operational Validation</w:t>
+            </w:r>
+            <w:r>
+              <w:tab/>
+            </w:r>
+            <w:r>
+              <w:fldChar w:fldCharType="begin"/>
+            </w:r>
+            <w:r>
+              <w:instrText xml:space="preserve">PAGEREF _Toc443620057 \h</w:instrText>
+            </w:r>
+            <w:r>
+              <w:fldChar w:fldCharType="separate"/>
+            </w:r>
+            <w:r>
+              <w:rPr>
+                <w:rStyle w:val="Hyperlink"/>
+              </w:rPr>
+              <w:t>28</w:t>
+            </w:r>
+            <w:r>
+              <w:fldChar w:fldCharType="end"/>
+            </w:r>
+          </w:hyperlink>
+        </w:p>
+        <w:p>
+          <w:pPr>
+            <w:pStyle w:val="TOC2"/>
+            <w:tabs>
+              <w:tab w:val="right" w:leader="dot" w:pos="9735"/>
+            </w:tabs>
+            <w:bidi w:val="0"/>
+            <w:rPr>
+              <w:rStyle w:val="Hyperlink"/>
+            </w:rPr>
+          </w:pPr>
+          <w:hyperlink w:anchor="_Toc1389050218">
+            <w:r>
+              <w:rPr>
+                <w:rStyle w:val="Hyperlink"/>
+              </w:rPr>
+              <w:t>5.2 Dataset Profiling Results</w:t>
+            </w:r>
+            <w:r>
+              <w:tab/>
+            </w:r>
+            <w:r>
+              <w:fldChar w:fldCharType="begin"/>
+            </w:r>
+            <w:r>
+              <w:instrText xml:space="preserve">PAGEREF _Toc1389050218 \h</w:instrText>
+            </w:r>
+            <w:r>
+              <w:fldChar w:fldCharType="separate"/>
+            </w:r>
+            <w:r>
+              <w:rPr>
+                <w:rStyle w:val="Hyperlink"/>
+              </w:rPr>
+              <w:t>29</w:t>
+            </w:r>
+            <w:r>
+              <w:fldChar w:fldCharType="end"/>
+            </w:r>
+          </w:hyperlink>
+        </w:p>
+        <w:p>
+          <w:pPr>
+            <w:pStyle w:val="TOC4"/>
+            <w:tabs>
+              <w:tab w:val="right" w:leader="dot" w:pos="9735"/>
+            </w:tabs>
+            <w:bidi w:val="0"/>
+            <w:rPr>
+              <w:rStyle w:val="Hyperlink"/>
+            </w:rPr>
+          </w:pPr>
+          <w:hyperlink w:anchor="_Toc1573274413">
+            <w:r>
+              <w:rPr>
+                <w:rStyle w:val="Hyperlink"/>
+              </w:rPr>
+              <w:t>Figure 5: Pipeline initialisation through CrewAI orchestration</w:t>
+            </w:r>
+            <w:r>
+              <w:tab/>
+            </w:r>
+            <w:r>
+              <w:fldChar w:fldCharType="begin"/>
+            </w:r>
+            <w:r>
+              <w:instrText xml:space="preserve">PAGEREF _Toc1573274413 \h</w:instrText>
+            </w:r>
+            <w:r>
+              <w:fldChar w:fldCharType="separate"/>
+            </w:r>
+            <w:r>
+              <w:rPr>
+                <w:rStyle w:val="Hyperlink"/>
+              </w:rPr>
+              <w:t>29</w:t>
+            </w:r>
+            <w:r>
+              <w:fldChar w:fldCharType="end"/>
+            </w:r>
+          </w:hyperlink>
+        </w:p>
+        <w:p>
+          <w:pPr>
+            <w:pStyle w:val="TOC2"/>
+            <w:tabs>
+              <w:tab w:val="right" w:leader="dot" w:pos="9735"/>
+            </w:tabs>
+            <w:bidi w:val="0"/>
+            <w:rPr>
+              <w:rStyle w:val="Hyperlink"/>
+            </w:rPr>
+          </w:pPr>
+          <w:hyperlink w:anchor="_Toc1347913795">
+            <w:r>
+              <w:rPr>
+                <w:rStyle w:val="Hyperlink"/>
+              </w:rPr>
+              <w:t>5.3 Search-Space Construction Results</w:t>
+            </w:r>
+            <w:r>
+              <w:tab/>
+            </w:r>
+            <w:r>
+              <w:fldChar w:fldCharType="begin"/>
+            </w:r>
+            <w:r>
+              <w:instrText xml:space="preserve">PAGEREF _Toc1347913795 \h</w:instrText>
+            </w:r>
+            <w:r>
+              <w:fldChar w:fldCharType="separate"/>
+            </w:r>
+            <w:r>
+              <w:rPr>
+                <w:rStyle w:val="Hyperlink"/>
+              </w:rPr>
+              <w:t>30</w:t>
+            </w:r>
+            <w:r>
+              <w:fldChar w:fldCharType="end"/>
+            </w:r>
+          </w:hyperlink>
+        </w:p>
+        <w:p>
+          <w:pPr>
+            <w:pStyle w:val="TOC4"/>
+            <w:tabs>
+              <w:tab w:val="right" w:leader="dot" w:pos="9735"/>
+            </w:tabs>
+            <w:bidi w:val="0"/>
+            <w:rPr>
+              <w:rStyle w:val="Hyperlink"/>
+            </w:rPr>
+          </w:pPr>
+          <w:hyperlink w:anchor="_Toc1656973723">
+            <w:r>
+              <w:rPr>
+                <w:rStyle w:val="Hyperlink"/>
+              </w:rPr>
+              <w:t>Figure 6: Structured architecture planning output generated by the Builder Agent</w:t>
+            </w:r>
+            <w:r>
+              <w:tab/>
+            </w:r>
+            <w:r>
+              <w:fldChar w:fldCharType="begin"/>
+            </w:r>
+            <w:r>
+              <w:instrText xml:space="preserve">PAGEREF _Toc1656973723 \h</w:instrText>
+            </w:r>
+            <w:r>
+              <w:fldChar w:fldCharType="separate"/>
+            </w:r>
+            <w:r>
+              <w:rPr>
+                <w:rStyle w:val="Hyperlink"/>
+              </w:rPr>
+              <w:t>31</w:t>
+            </w:r>
+            <w:r>
+              <w:fldChar w:fldCharType="end"/>
+            </w:r>
+          </w:hyperlink>
+        </w:p>
+        <w:p>
+          <w:pPr>
+            <w:pStyle w:val="TOC2"/>
+            <w:tabs>
+              <w:tab w:val="right" w:leader="dot" w:pos="9735"/>
+            </w:tabs>
+            <w:bidi w:val="0"/>
+            <w:rPr>
+              <w:rStyle w:val="Hyperlink"/>
+            </w:rPr>
+          </w:pPr>
+          <w:hyperlink w:anchor="_Toc1743309486">
+            <w:r>
+              <w:rPr>
+                <w:rStyle w:val="Hyperlink"/>
+              </w:rPr>
+              <w:t>5.4 Optimisation Results</w:t>
+            </w:r>
+            <w:r>
+              <w:tab/>
+            </w:r>
+            <w:r>
+              <w:fldChar w:fldCharType="begin"/>
+            </w:r>
+            <w:r>
+              <w:instrText xml:space="preserve">PAGEREF _Toc1743309486 \h</w:instrText>
+            </w:r>
+            <w:r>
+              <w:fldChar w:fldCharType="separate"/>
+            </w:r>
+            <w:r>
+              <w:rPr>
+                <w:rStyle w:val="Hyperlink"/>
+              </w:rPr>
+              <w:t>31</w:t>
+            </w:r>
+            <w:r>
+              <w:fldChar w:fldCharType="end"/>
+            </w:r>
+          </w:hyperlink>
+        </w:p>
+        <w:p>
+          <w:pPr>
+            <w:pStyle w:val="TOC4"/>
+            <w:tabs>
+              <w:tab w:val="right" w:leader="dot" w:pos="9735"/>
+            </w:tabs>
+            <w:bidi w:val="0"/>
+            <w:rPr>
+              <w:rStyle w:val="Hyperlink"/>
+            </w:rPr>
+          </w:pPr>
+          <w:hyperlink w:anchor="_Toc2006207829">
+            <w:r>
+              <w:rPr>
+                <w:rStyle w:val="Hyperlink"/>
+              </w:rPr>
+              <w:t>Figure 7: Structured architecture planning output generated by the Builder Agent</w:t>
+            </w:r>
+            <w:r>
+              <w:tab/>
+            </w:r>
+            <w:r>
+              <w:fldChar w:fldCharType="begin"/>
+            </w:r>
+            <w:r>
+              <w:instrText xml:space="preserve">PAGEREF _Toc2006207829 \h</w:instrText>
+            </w:r>
+            <w:r>
+              <w:fldChar w:fldCharType="separate"/>
+            </w:r>
+            <w:r>
+              <w:rPr>
+                <w:rStyle w:val="Hyperlink"/>
+              </w:rPr>
+              <w:t>31</w:t>
+            </w:r>
+            <w:r>
+              <w:fldChar w:fldCharType="end"/>
+            </w:r>
+          </w:hyperlink>
+        </w:p>
+        <w:p>
+          <w:pPr>
+            <w:pStyle w:val="TOC2"/>
+            <w:tabs>
+              <w:tab w:val="right" w:leader="dot" w:pos="9735"/>
+            </w:tabs>
+            <w:bidi w:val="0"/>
+            <w:rPr>
+              <w:rStyle w:val="Hyperlink"/>
+            </w:rPr>
+          </w:pPr>
+          <w:hyperlink w:anchor="_Toc317867808">
+            <w:r>
+              <w:rPr>
+                <w:rStyle w:val="Hyperlink"/>
+              </w:rPr>
+              <w:t>5.5 Evaluation and Model Selection</w:t>
+            </w:r>
+            <w:r>
+              <w:tab/>
+            </w:r>
+            <w:r>
+              <w:fldChar w:fldCharType="begin"/>
+            </w:r>
+            <w:r>
+              <w:instrText xml:space="preserve">PAGEREF _Toc317867808 \h</w:instrText>
+            </w:r>
+            <w:r>
+              <w:fldChar w:fldCharType="separate"/>
+            </w:r>
+            <w:r>
+              <w:rPr>
+                <w:rStyle w:val="Hyperlink"/>
+              </w:rPr>
+              <w:t>32</w:t>
+            </w:r>
+            <w:r>
+              <w:fldChar w:fldCharType="end"/>
+            </w:r>
+          </w:hyperlink>
+        </w:p>
+        <w:p>
+          <w:pPr>
+            <w:pStyle w:val="TOC4"/>
+            <w:tabs>
+              <w:tab w:val="right" w:leader="dot" w:pos="9735"/>
+            </w:tabs>
+            <w:bidi w:val="0"/>
+            <w:rPr>
+              <w:rStyle w:val="Hyperlink"/>
+            </w:rPr>
+          </w:pPr>
+          <w:hyperlink w:anchor="_Toc680452538">
+            <w:r>
+              <w:rPr>
+                <w:rStyle w:val="Hyperlink"/>
+              </w:rPr>
+              <w:t>Figure 8: Final architecture selection produced by the Evaluator Agent</w:t>
+            </w:r>
+            <w:r>
+              <w:tab/>
+            </w:r>
+            <w:r>
+              <w:fldChar w:fldCharType="begin"/>
+            </w:r>
+            <w:r>
+              <w:instrText xml:space="preserve">PAGEREF _Toc680452538 \h</w:instrText>
+            </w:r>
+            <w:r>
+              <w:fldChar w:fldCharType="separate"/>
+            </w:r>
+            <w:r>
+              <w:rPr>
+                <w:rStyle w:val="Hyperlink"/>
+              </w:rPr>
+              <w:t>33</w:t>
+            </w:r>
+            <w:r>
+              <w:fldChar w:fldCharType="end"/>
+            </w:r>
+          </w:hyperlink>
+        </w:p>
+        <w:p>
+          <w:pPr>
+            <w:pStyle w:val="TOC2"/>
+            <w:tabs>
+              <w:tab w:val="right" w:leader="dot" w:pos="9735"/>
+            </w:tabs>
+            <w:bidi w:val="0"/>
+            <w:rPr>
+              <w:rStyle w:val="Hyperlink"/>
+            </w:rPr>
+          </w:pPr>
+          <w:hyperlink w:anchor="_Toc1009645308">
+            <w:r>
+              <w:rPr>
+                <w:rStyle w:val="Hyperlink"/>
+              </w:rPr>
+              <w:t>5.6 Discussion</w:t>
+            </w:r>
+            <w:r>
+              <w:tab/>
+            </w:r>
+            <w:r>
+              <w:fldChar w:fldCharType="begin"/>
+            </w:r>
+            <w:r>
+              <w:instrText xml:space="preserve">PAGEREF _Toc1009645308 \h</w:instrText>
+            </w:r>
+            <w:r>
+              <w:fldChar w:fldCharType="separate"/>
+            </w:r>
+            <w:r>
+              <w:rPr>
+                <w:rStyle w:val="Hyperlink"/>
+              </w:rPr>
+              <w:t>33</w:t>
+            </w:r>
+            <w:r>
+              <w:fldChar w:fldCharType="end"/>
+            </w:r>
+          </w:hyperlink>
+        </w:p>
+        <w:p>
+          <w:pPr>
+            <w:pStyle w:val="TOC4"/>
+            <w:tabs>
+              <w:tab w:val="right" w:leader="dot" w:pos="9735"/>
+            </w:tabs>
+            <w:bidi w:val="0"/>
+            <w:rPr>
+              <w:rStyle w:val="Hyperlink"/>
+            </w:rPr>
+          </w:pPr>
+          <w:hyperlink w:anchor="_Toc1684890337">
+            <w:r>
+              <w:rPr>
+                <w:rStyle w:val="Hyperlink"/>
+              </w:rPr>
+              <w:t>Table 04: Positioning of the Proposed Framework</w:t>
+            </w:r>
+            <w:r>
+              <w:tab/>
+            </w:r>
+            <w:r>
+              <w:fldChar w:fldCharType="begin"/>
+            </w:r>
+            <w:r>
+              <w:instrText xml:space="preserve">PAGEREF _Toc1684890337 \h</w:instrText>
+            </w:r>
+            <w:r>
+              <w:fldChar w:fldCharType="separate"/>
+            </w:r>
+            <w:r>
+              <w:rPr>
+                <w:rStyle w:val="Hyperlink"/>
+              </w:rPr>
+              <w:t>34</w:t>
+            </w:r>
+            <w:r>
+              <w:fldChar w:fldCharType="end"/>
+            </w:r>
+          </w:hyperlink>
+        </w:p>
+        <w:p>
+          <w:pPr>
+            <w:pStyle w:val="TOC2"/>
+            <w:tabs>
+              <w:tab w:val="right" w:leader="dot" w:pos="9735"/>
+            </w:tabs>
+            <w:bidi w:val="0"/>
+            <w:rPr>
+              <w:rStyle w:val="Hyperlink"/>
+            </w:rPr>
+          </w:pPr>
+          <w:hyperlink w:anchor="_Toc1855459851">
+            <w:r>
+              <w:rPr>
+                <w:rStyle w:val="Hyperlink"/>
+              </w:rPr>
+              <w:t>6. Conclusion and Broader Implications</w:t>
+            </w:r>
+            <w:r>
+              <w:tab/>
+            </w:r>
+            <w:r>
+              <w:fldChar w:fldCharType="begin"/>
+            </w:r>
+            <w:r>
+              <w:instrText xml:space="preserve">PAGEREF _Toc1855459851 \h</w:instrText>
+            </w:r>
+            <w:r>
+              <w:fldChar w:fldCharType="separate"/>
+            </w:r>
+            <w:r>
+              <w:rPr>
+                <w:rStyle w:val="Hyperlink"/>
+              </w:rPr>
+              <w:t>34</w:t>
+            </w:r>
+            <w:r>
+              <w:fldChar w:fldCharType="end"/>
+            </w:r>
+          </w:hyperlink>
+        </w:p>
+        <w:p>
+          <w:pPr>
+            <w:pStyle w:val="TOC1"/>
+            <w:tabs>
+              <w:tab w:val="right" w:leader="dot" w:pos="9735"/>
+            </w:tabs>
+            <w:bidi w:val="0"/>
+            <w:rPr>
+              <w:rStyle w:val="Hyperlink"/>
+            </w:rPr>
+          </w:pPr>
+          <w:hyperlink w:anchor="_Toc80453346">
+            <w:r>
+              <w:rPr>
+                <w:rStyle w:val="Hyperlink"/>
+              </w:rPr>
+              <w:t>7. Bibliography</w:t>
+            </w:r>
+            <w:r>
+              <w:tab/>
+            </w:r>
+            <w:r>
+              <w:fldChar w:fldCharType="begin"/>
+            </w:r>
+            <w:r>
+              <w:instrText xml:space="preserve">PAGEREF _Toc80453346 \h</w:instrText>
+            </w:r>
+            <w:r>
+              <w:fldChar w:fldCharType="separate"/>
+            </w:r>
+            <w:r>
+              <w:rPr>
+                <w:rStyle w:val="Hyperlink"/>
+              </w:rPr>
+              <w:t>36</w:t>
+            </w:r>
+            <w:r>
+              <w:fldChar w:fldCharType="end"/>
+            </w:r>
+          </w:hyperlink>
+        </w:p>
+        <w:p>
+          <w:pPr>
+            <w:pStyle w:val="TOC1"/>
+            <w:tabs>
+              <w:tab w:val="right" w:leader="dot" w:pos="9735"/>
+            </w:tabs>
+            <w:bidi w:val="0"/>
+            <w:rPr>
+              <w:rStyle w:val="Hyperlink"/>
+            </w:rPr>
+          </w:pPr>
+          <w:hyperlink w:anchor="_Toc190237094">
+            <w:r>
+              <w:rPr>
+                <w:rStyle w:val="Hyperlink"/>
+              </w:rPr>
+              <w:t>8. Appendices</w:t>
+            </w:r>
+            <w:r>
+              <w:tab/>
+            </w:r>
+            <w:r>
+              <w:fldChar w:fldCharType="begin"/>
+            </w:r>
+            <w:r>
+              <w:instrText xml:space="preserve">PAGEREF _Toc190237094 \h</w:instrText>
+            </w:r>
+            <w:r>
+              <w:fldChar w:fldCharType="separate"/>
+            </w:r>
+            <w:r>
+              <w:rPr>
+                <w:rStyle w:val="Hyperlink"/>
+              </w:rPr>
+              <w:t>39</w:t>
+            </w:r>
+            <w:r>
+              <w:fldChar w:fldCharType="end"/>
+            </w:r>
+          </w:hyperlink>
+        </w:p>
+        <w:p>
+          <w:pPr>
+            <w:pStyle w:val="TOC2"/>
+            <w:tabs>
+              <w:tab w:val="right" w:leader="dot" w:pos="9735"/>
+            </w:tabs>
+            <w:bidi w:val="0"/>
+            <w:rPr>
+              <w:rStyle w:val="Hyperlink"/>
+            </w:rPr>
+          </w:pPr>
+          <w:hyperlink w:anchor="_Toc1280569866">
+            <w:r>
+              <w:rPr>
+                <w:rStyle w:val="Hyperlink"/>
+              </w:rPr>
+              <w:t>Appendix A — Datasets Used in Experimental Validation</w:t>
+            </w:r>
+            <w:r>
+              <w:tab/>
+            </w:r>
+            <w:r>
+              <w:fldChar w:fldCharType="begin"/>
+            </w:r>
+            <w:r>
+              <w:instrText xml:space="preserve">PAGEREF _Toc1280569866 \h</w:instrText>
+            </w:r>
+            <w:r>
+              <w:fldChar w:fldCharType="separate"/>
+            </w:r>
+            <w:r>
+              <w:rPr>
+                <w:rStyle w:val="Hyperlink"/>
+              </w:rPr>
+              <w:t>39</w:t>
+            </w:r>
+            <w:r>
+              <w:fldChar w:fldCharType="end"/>
+            </w:r>
+          </w:hyperlink>
+        </w:p>
+        <w:p>
+          <w:pPr>
+            <w:pStyle w:val="TOC2"/>
+            <w:tabs>
+              <w:tab w:val="right" w:leader="dot" w:pos="9735"/>
+            </w:tabs>
+            <w:bidi w:val="0"/>
+            <w:rPr>
+              <w:rStyle w:val="Hyperlink"/>
+            </w:rPr>
+          </w:pPr>
+          <w:hyperlink w:anchor="_Toc444371046">
+            <w:r>
+              <w:rPr>
+                <w:rStyle w:val="Hyperlink"/>
+              </w:rPr>
+              <w:t>A.1 ECG Sleep Apnea Dataset (Primary Experimental Dataset)</w:t>
+            </w:r>
+            <w:r>
+              <w:tab/>
+            </w:r>
+            <w:r>
+              <w:fldChar w:fldCharType="begin"/>
+            </w:r>
+            <w:r>
+              <w:instrText xml:space="preserve">PAGEREF _Toc444371046 \h</w:instrText>
+            </w:r>
+            <w:r>
+              <w:fldChar w:fldCharType="separate"/>
+            </w:r>
+            <w:r>
+              <w:rPr>
+                <w:rStyle w:val="Hyperlink"/>
+              </w:rPr>
+              <w:t>39</w:t>
+            </w:r>
+            <w:r>
+              <w:fldChar w:fldCharType="end"/>
+            </w:r>
+          </w:hyperlink>
+        </w:p>
+        <w:p>
+          <w:pPr>
+            <w:pStyle w:val="TOC2"/>
+            <w:tabs>
+              <w:tab w:val="right" w:leader="dot" w:pos="9735"/>
+            </w:tabs>
+            <w:bidi w:val="0"/>
+            <w:rPr>
+              <w:rStyle w:val="Hyperlink"/>
+            </w:rPr>
+          </w:pPr>
+          <w:hyperlink w:anchor="_Toc1371765763">
+            <w:r>
+              <w:rPr>
+                <w:rStyle w:val="Hyperlink"/>
+              </w:rPr>
+              <w:t>A.3 Dataset Selection Rationale</w:t>
+            </w:r>
+            <w:r>
+              <w:tab/>
+            </w:r>
+            <w:r>
+              <w:fldChar w:fldCharType="begin"/>
+            </w:r>
+            <w:r>
+              <w:instrText xml:space="preserve">PAGEREF _Toc1371765763 \h</w:instrText>
+            </w:r>
+            <w:r>
+              <w:fldChar w:fldCharType="separate"/>
+            </w:r>
+            <w:r>
+              <w:rPr>
+                <w:rStyle w:val="Hyperlink"/>
+              </w:rPr>
+              <w:t>42</w:t>
+            </w:r>
+            <w:r>
+              <w:fldChar w:fldCharType="end"/>
+            </w:r>
+          </w:hyperlink>
+        </w:p>
+        <w:p>
+          <w:pPr>
+            <w:pStyle w:val="TOC2"/>
+            <w:tabs>
+              <w:tab w:val="right" w:leader="dot" w:pos="9735"/>
+            </w:tabs>
+            <w:bidi w:val="0"/>
+            <w:rPr>
+              <w:rStyle w:val="Hyperlink"/>
+            </w:rPr>
+          </w:pPr>
+          <w:hyperlink w:anchor="_Toc1309282674">
+            <w:r>
+              <w:rPr>
+                <w:rStyle w:val="Hyperlink"/>
+              </w:rPr>
+              <w:t>Appendix B — Example Pipeline Artifacts</w:t>
+            </w:r>
+            <w:r>
+              <w:tab/>
+            </w:r>
+            <w:r>
+              <w:fldChar w:fldCharType="begin"/>
+            </w:r>
+            <w:r>
+              <w:instrText xml:space="preserve">PAGEREF _Toc1309282674 \h</w:instrText>
+            </w:r>
+            <w:r>
+              <w:fldChar w:fldCharType="separate"/>
+            </w:r>
+            <w:r>
+              <w:rPr>
+                <w:rStyle w:val="Hyperlink"/>
+              </w:rPr>
+              <w:t>43</w:t>
+            </w:r>
+            <w:r>
+              <w:fldChar w:fldCharType="end"/>
+            </w:r>
+          </w:hyperlink>
+        </w:p>
+        <w:p>
+          <w:pPr>
+            <w:pStyle w:val="TOC2"/>
+            <w:tabs>
+              <w:tab w:val="right" w:leader="dot" w:pos="9735"/>
+            </w:tabs>
+            <w:bidi w:val="0"/>
+            <w:rPr>
+              <w:rStyle w:val="Hyperlink"/>
+            </w:rPr>
+          </w:pPr>
+          <w:hyperlink w:anchor="_Toc132138356">
+            <w:r>
+              <w:rPr>
+                <w:rStyle w:val="Hyperlink"/>
+              </w:rPr>
+              <w:t>B.1 Run Manifest</w:t>
+            </w:r>
+            <w:r>
+              <w:tab/>
+            </w:r>
+            <w:r>
+              <w:fldChar w:fldCharType="begin"/>
+            </w:r>
+            <w:r>
+              <w:instrText xml:space="preserve">PAGEREF _Toc132138356 \h</w:instrText>
+            </w:r>
+            <w:r>
+              <w:fldChar w:fldCharType="separate"/>
+            </w:r>
+            <w:r>
+              <w:rPr>
+                <w:rStyle w:val="Hyperlink"/>
+              </w:rPr>
+              <w:t>43</w:t>
+            </w:r>
+            <w:r>
+              <w:fldChar w:fldCharType="end"/>
+            </w:r>
+          </w:hyperlink>
+        </w:p>
+        <w:p>
+          <w:pPr>
+            <w:pStyle w:val="TOC2"/>
+            <w:tabs>
+              <w:tab w:val="right" w:leader="dot" w:pos="9735"/>
+            </w:tabs>
+            <w:bidi w:val="0"/>
+            <w:rPr>
+              <w:rStyle w:val="Hyperlink"/>
+            </w:rPr>
+          </w:pPr>
+          <w:hyperlink w:anchor="_Toc1757029820">
+            <w:r>
+              <w:rPr>
+                <w:rStyle w:val="Hyperlink"/>
+              </w:rPr>
+              <w:t>B.2 Example Profiler Output</w:t>
+            </w:r>
+            <w:r>
+              <w:tab/>
+            </w:r>
+            <w:r>
+              <w:fldChar w:fldCharType="begin"/>
+            </w:r>
+            <w:r>
+              <w:instrText xml:space="preserve">PAGEREF _Toc1757029820 \h</w:instrText>
+            </w:r>
+            <w:r>
+              <w:fldChar w:fldCharType="separate"/>
+            </w:r>
+            <w:r>
+              <w:rPr>
+                <w:rStyle w:val="Hyperlink"/>
+              </w:rPr>
+              <w:t>43</w:t>
+            </w:r>
+            <w:r>
+              <w:fldChar w:fldCharType="end"/>
+            </w:r>
+          </w:hyperlink>
+        </w:p>
+        <w:p>
+          <w:pPr>
+            <w:pStyle w:val="TOC2"/>
+            <w:tabs>
+              <w:tab w:val="right" w:leader="dot" w:pos="9735"/>
+            </w:tabs>
+            <w:bidi w:val="0"/>
+            <w:rPr>
+              <w:rStyle w:val="Hyperlink"/>
+            </w:rPr>
+          </w:pPr>
+          <w:hyperlink w:anchor="_Toc682848272">
+            <w:r>
+              <w:rPr>
+                <w:rStyle w:val="Hyperlink"/>
+              </w:rPr>
+              <w:t>B.3 Example Builder Output</w:t>
+            </w:r>
+            <w:r>
+              <w:tab/>
+            </w:r>
+            <w:r>
+              <w:fldChar w:fldCharType="begin"/>
+            </w:r>
+            <w:r>
+              <w:instrText xml:space="preserve">PAGEREF _Toc682848272 \h</w:instrText>
+            </w:r>
+            <w:r>
+              <w:fldChar w:fldCharType="separate"/>
+            </w:r>
+            <w:r>
+              <w:rPr>
+                <w:rStyle w:val="Hyperlink"/>
+              </w:rPr>
+              <w:t>44</w:t>
+            </w:r>
+            <w:r>
+              <w:fldChar w:fldCharType="end"/>
+            </w:r>
+          </w:hyperlink>
+        </w:p>
+        <w:p>
+          <w:pPr>
+            <w:pStyle w:val="TOC2"/>
+            <w:tabs>
+              <w:tab w:val="right" w:leader="dot" w:pos="9735"/>
+            </w:tabs>
+            <w:bidi w:val="0"/>
+            <w:rPr>
+              <w:rStyle w:val="Hyperlink"/>
+            </w:rPr>
+          </w:pPr>
+          <w:hyperlink w:anchor="_Toc1212611504">
+            <w:r>
+              <w:rPr>
+                <w:rStyle w:val="Hyperlink"/>
+              </w:rPr>
+              <w:t>B.4 Example Training Output</w:t>
+            </w:r>
+            <w:r>
+              <w:tab/>
+            </w:r>
+            <w:r>
+              <w:fldChar w:fldCharType="begin"/>
+            </w:r>
+            <w:r>
+              <w:instrText xml:space="preserve">PAGEREF _Toc1212611504 \h</w:instrText>
+            </w:r>
+            <w:r>
+              <w:fldChar w:fldCharType="separate"/>
+            </w:r>
+            <w:r>
+              <w:rPr>
+                <w:rStyle w:val="Hyperlink"/>
+              </w:rPr>
+              <w:t>44</w:t>
+            </w:r>
+            <w:r>
+              <w:fldChar w:fldCharType="end"/>
+            </w:r>
+          </w:hyperlink>
+        </w:p>
+        <w:p>
+          <w:pPr>
+            <w:pStyle w:val="TOC2"/>
+            <w:tabs>
+              <w:tab w:val="right" w:leader="dot" w:pos="9735"/>
+            </w:tabs>
+            <w:bidi w:val="0"/>
+            <w:rPr>
+              <w:rStyle w:val="Hyperlink"/>
+            </w:rPr>
+          </w:pPr>
+          <w:hyperlink w:anchor="_Toc341856623">
+            <w:r>
+              <w:rPr>
+                <w:rStyle w:val="Hyperlink"/>
+              </w:rPr>
+              <w:t>B.5 Final Generated Report</w:t>
+            </w:r>
+            <w:r>
+              <w:tab/>
+            </w:r>
+            <w:r>
+              <w:fldChar w:fldCharType="begin"/>
+            </w:r>
+            <w:r>
+              <w:instrText xml:space="preserve">PAGEREF _Toc341856623 \h</w:instrText>
+            </w:r>
+            <w:r>
+              <w:fldChar w:fldCharType="separate"/>
+            </w:r>
+            <w:r>
+              <w:rPr>
+                <w:rStyle w:val="Hyperlink"/>
+              </w:rPr>
+              <w:t>44</w:t>
+            </w:r>
+            <w:r>
+              <w:fldChar w:fldCharType="end"/>
+            </w:r>
+          </w:hyperlink>
+        </w:p>
+        <w:p>
+          <w:pPr>
+            <w:pStyle w:val="TOC2"/>
+            <w:tabs>
+              <w:tab w:val="right" w:leader="dot" w:pos="9735"/>
+            </w:tabs>
+            <w:bidi w:val="0"/>
+            <w:rPr>
+              <w:rStyle w:val="Hyperlink"/>
+            </w:rPr>
+          </w:pPr>
+          <w:hyperlink w:anchor="_Toc1217813014">
+            <w:r>
+              <w:rPr>
+                <w:rStyle w:val="Hyperlink"/>
+              </w:rPr>
+              <w:t>B.6 Artefact Directory Structure</w:t>
+            </w:r>
+            <w:r>
+              <w:tab/>
+            </w:r>
+            <w:r>
+              <w:fldChar w:fldCharType="begin"/>
+            </w:r>
+            <w:r>
+              <w:instrText xml:space="preserve">PAGEREF _Toc1217813014 \h</w:instrText>
+            </w:r>
+            <w:r>
+              <w:fldChar w:fldCharType="separate"/>
+            </w:r>
+            <w:r>
+              <w:rPr>
+                <w:rStyle w:val="Hyperlink"/>
+              </w:rPr>
+              <w:t>45</w:t>
+            </w:r>
+            <w:r>
+              <w:fldChar w:fldCharType="end"/>
+            </w:r>
+          </w:hyperlink>
+        </w:p>
+        <w:p>
+          <w:pPr>
+            <w:pStyle w:val="TOC1"/>
+            <w:tabs>
+              <w:tab w:val="right" w:leader="dot" w:pos="9735"/>
+            </w:tabs>
+            <w:bidi w:val="0"/>
+          </w:pPr>
+          <w:hyperlink w:anchor="_Toc400237606">
+            <w:r>
+              <w:rPr>
+                <w:rStyle w:val="Hyperlink"/>
+              </w:rPr>
+              <w:t>Appendix C — AI-Assisted Development Disclosure</w:t>
+            </w:r>
+            <w:r>
+              <w:tab/>
+            </w:r>
+            <w:r>
+              <w:fldChar w:fldCharType="begin"/>
+            </w:r>
+            <w:r>
+              <w:instrText xml:space="preserve">PAGEREF _Toc400237606 \h</w:instrText>
+            </w:r>
+            <w:r>
+              <w:fldChar w:fldCharType="separate"/>
+            </w:r>
+            <w:r>
+              <w:rPr>
+                <w:rStyle w:val="Hyperlink"/>
+              </w:rPr>
+              <w:t>45</w:t>
+            </w:r>
+            <w:r>
+              <w:fldChar w:fldCharType="end"/>
+            </w:r>
+          </w:hyperlink>
+        </w:p>
+        <w:p>
+          <w:r>
+            <w:fldChar w:fldCharType="end"/>
+          </w:r>
+        </w:p>
+      </w:sdtContent>
+    </w:sdt>
+    <w:p>
+      <w:pPr>
+        <w:pStyle w:val="Normal"/>
+        <w:jc w:val="center"/>
+        <w:rPr>
+          <w:rFonts w:ascii="Arial" w:hAnsi="Arial" w:eastAsia="Arial" w:cs="Arial"/>
+          <w:b w:val="0"/>
+          <w:bCs w:val="0"/>
+          <w:i w:val="0"/>
+          <w:iCs w:val="0"/>
+          <w:caps w:val="0"/>
+          <w:smallCaps w:val="0"/>
+          <w:noProof w:val="0"/>
+          <w:color w:val="auto"/>
+          <w:sz w:val="28"/>
+          <w:szCs w:val="28"/>
+          <w:lang w:val="pt-BR"/>
+        </w:rPr>
+      </w:pPr>
+    </w:p>
+    <w:p>
+      <w:pPr>
+        <w:pStyle w:val="Normal"/>
+        <w:jc w:val="center"/>
+        <w:rPr>
+          <w:rFonts w:ascii="Arial" w:hAnsi="Arial" w:eastAsia="Arial" w:cs="Arial"/>
+          <w:b w:val="0"/>
+          <w:bCs w:val="0"/>
+          <w:i w:val="0"/>
+          <w:iCs w:val="0"/>
+          <w:caps w:val="0"/>
+          <w:smallCaps w:val="0"/>
+          <w:noProof w:val="0"/>
+          <w:color w:val="auto"/>
+          <w:sz w:val="28"/>
+          <w:szCs w:val="28"/>
+          <w:lang w:val="pt-BR"/>
+        </w:rPr>
+      </w:pPr>
+    </w:p>
+    <w:p>
+      <w:pPr>
+        <w:pStyle w:val="nasheaders"/>
+      </w:pPr>
+    </w:p>
+    <w:p>
+      <w:pPr/>
+      <w:r>
+        <w:br w:type="page"/>
+      </w:r>
     </w:p>
     <w:p>
       <w:pPr>
@@ -1822,6 +4838,7 @@
           <w:lang w:val="pt-BR"/>
         </w:rPr>
       </w:pPr>
+      <w:bookmarkStart w:name="_Toc586859991" w:id="1680795634"/>
       <w:r>
         <w:rPr/>
         <w:t xml:space="preserve">1. </w:t>
@@ -1830,6 +4847,7 @@
         <w:rPr/>
         <w:t>Introduction</w:t>
       </w:r>
+      <w:bookmarkEnd w:id="1680795634"/>
       <w:r>
         <w:rPr/>
         <w:t xml:space="preserve"> </w:t>
@@ -1845,10 +4863,12 @@
           <w:lang w:val="en-US"/>
         </w:rPr>
       </w:pPr>
+      <w:bookmarkStart w:name="_Toc1812750393" w:id="943435551"/>
       <w:r>
         <w:rPr/>
         <w:t>1.1 Motivation</w:t>
       </w:r>
+      <w:bookmarkEnd w:id="943435551"/>
     </w:p>
     <w:p>
       <w:pPr>
@@ -2968,6 +5988,7 @@
         </w:rPr>
       </w:pPr>
       <w:commentRangeStart w:id="2031962292"/>
+      <w:bookmarkStart w:name="_Toc1502868997" w:id="1550035034"/>
       <w:r>
         <w:rPr/>
         <w:t>1.</w:t>
@@ -2987,6 +6008,7 @@
         </w:rPr>
         <w:commentReference w:id="2031962292"/>
       </w:r>
+      <w:bookmarkEnd w:id="1550035034"/>
     </w:p>
     <w:p>
       <w:pPr>
@@ -3037,6 +6059,7 @@
           <w:lang w:val="en-GB"/>
         </w:rPr>
       </w:pPr>
+      <w:bookmarkStart w:name="_Toc1222365834" w:id="500371813"/>
       <w:r>
         <w:rPr>
           <w:noProof w:val="0"/>
@@ -3044,6 +6067,7 @@
         </w:rPr>
         <w:t>1.3 Research Aim and Contributions</w:t>
       </w:r>
+      <w:bookmarkEnd w:id="500371813"/>
     </w:p>
     <w:p>
       <w:pPr>
@@ -3267,10 +6291,12 @@
           <w:lang w:val="en-US"/>
         </w:rPr>
       </w:pPr>
+      <w:bookmarkStart w:name="_Toc1899335751" w:id="248630661"/>
       <w:r>
         <w:rPr/>
         <w:t>2. Programme Alignment</w:t>
       </w:r>
+      <w:bookmarkEnd w:id="248630661"/>
     </w:p>
     <w:p>
       <w:pPr>
@@ -3543,6 +6569,7 @@
           <w:lang w:val="en-US"/>
         </w:rPr>
       </w:pPr>
+      <w:bookmarkStart w:name="_Toc810830369" w:id="1553587082"/>
       <w:r>
         <w:rPr/>
         <w:t>3</w:t>
@@ -3555,6 +6582,7 @@
         <w:rPr/>
         <w:t>Literature Review</w:t>
       </w:r>
+      <w:bookmarkEnd w:id="1553587082"/>
     </w:p>
     <w:p>
       <w:pPr>
@@ -3564,6 +6592,7 @@
           <w:color w:val="auto"/>
         </w:rPr>
       </w:pPr>
+      <w:bookmarkStart w:name="_Toc1768056434" w:id="1869208369"/>
       <w:r>
         <w:rPr/>
         <w:t>3</w:t>
@@ -3580,6 +6609,7 @@
         <w:rPr/>
         <w:t>Deep Neural Networks and the Architecture Design Problem</w:t>
       </w:r>
+      <w:bookmarkEnd w:id="1869208369"/>
     </w:p>
     <w:p>
       <w:pPr>
@@ -3744,6 +6774,7 @@
           <w:color w:val="auto"/>
         </w:rPr>
       </w:pPr>
+      <w:bookmarkStart w:name="_Toc559349959" w:id="1518706100"/>
       <w:r>
         <w:rPr/>
         <w:t>3</w:t>
@@ -3760,6 +6791,7 @@
         <w:rPr/>
         <w:t>eural Architecture Search Foundations</w:t>
       </w:r>
+      <w:bookmarkEnd w:id="1518706100"/>
     </w:p>
     <w:p>
       <w:pPr>
@@ -4132,12 +7164,21 @@
           <w:lang w:val="en-US"/>
         </w:rPr>
       </w:pPr>
-      <w:r>
-        <w:rPr>
-          <w:rFonts w:ascii="Arial" w:hAnsi="Arial" w:eastAsia="Arial" w:cs="Arial"/>
-          <w:color w:val="auto"/>
-        </w:rPr>
-        <w:t xml:space="preserve">Figure 1: Illustration of NAS three fundamental components  </w:t>
+      <w:bookmarkStart w:name="_Toc871030335" w:id="629852840"/>
+      <w:r>
+        <w:rPr>
+          <w:rFonts w:ascii="Arial" w:hAnsi="Arial" w:eastAsia="Arial" w:cs="Arial"/>
+          <w:color w:val="auto"/>
+        </w:rPr>
+        <w:t>Figure 1: Illustration of NAS three fundamental components</w:t>
+      </w:r>
+      <w:bookmarkEnd w:id="629852840"/>
+      <w:r>
+        <w:rPr>
+          <w:rFonts w:ascii="Arial" w:hAnsi="Arial" w:eastAsia="Arial" w:cs="Arial"/>
+          <w:color w:val="auto"/>
+        </w:rPr>
+        <w:t xml:space="preserve">  </w:t>
       </w:r>
     </w:p>
     <w:p>
@@ -4162,7 +7203,7 @@
       </w:pPr>
       <w:r>
         <w:drawing>
-          <wp:inline wp14:editId="3B5AACCA" wp14:anchorId="0585D613">
+          <wp:inline wp14:editId="321B1CE9" wp14:anchorId="0585D613">
             <wp:extent cx="6181725" cy="1420098"/>
             <wp:effectExtent l="0" t="0" r="0" b="0"/>
             <wp:docPr id="159377487" name="drawing"/>
@@ -4219,7 +7260,7 @@
         </w:rPr>
         <w:t xml:space="preserve">(Image source: </w:t>
       </w:r>
-      <w:hyperlink r:id="R25c2114a73924e82">
+      <w:hyperlink r:id="R27c931d7425347b7">
         <w:r>
           <w:rPr>
             <w:rFonts w:ascii="Arial" w:hAnsi="Arial" w:eastAsia="Arial" w:cs="Arial"/>
@@ -4424,6 +7465,7 @@
           <w:lang w:val="en-US"/>
         </w:rPr>
       </w:pPr>
+      <w:bookmarkStart w:name="_Toc1935293189" w:id="305018505"/>
       <w:r>
         <w:rPr/>
         <w:t>3</w:t>
@@ -4444,6 +7486,7 @@
         <w:rPr/>
         <w:t>Classical NAS Paradigms</w:t>
       </w:r>
+      <w:bookmarkEnd w:id="305018505"/>
     </w:p>
     <w:p>
       <w:pPr>
@@ -4577,6 +7620,7 @@
           <w:color w:val="auto"/>
         </w:rPr>
       </w:pPr>
+      <w:bookmarkStart w:name="_Toc807765269" w:id="1036602433"/>
       <w:r>
         <w:rPr/>
         <w:t>3.3.1 Reinforcement</w:t>
@@ -4585,6 +7629,7 @@
         <w:rPr/>
         <w:t xml:space="preserve"> Learning-Based NAS</w:t>
       </w:r>
+      <w:bookmarkEnd w:id="1036602433"/>
     </w:p>
     <w:p>
       <w:pPr>
@@ -4893,6 +7938,7 @@
           <w:color w:val="auto"/>
         </w:rPr>
       </w:pPr>
+      <w:bookmarkStart w:name="_Toc830539960" w:id="1328814647"/>
       <w:r>
         <w:rPr/>
         <w:t>3</w:t>
@@ -4905,6 +7951,7 @@
         <w:rPr/>
         <w:t>lutionary Neural Architecture Search</w:t>
       </w:r>
+      <w:bookmarkEnd w:id="1328814647"/>
     </w:p>
     <w:p>
       <w:pPr>
@@ -4983,6 +8030,7 @@
           <w:lang w:eastAsia="en-US" w:bidi="ar-SA"/>
         </w:rPr>
       </w:pPr>
+      <w:bookmarkStart w:name="_Toc1200992875" w:id="266217263"/>
       <w:r>
         <w:rPr/>
         <w:t>3</w:t>
@@ -4995,6 +8043,7 @@
         <w:rPr/>
         <w:t>cient Search</w:t>
       </w:r>
+      <w:bookmarkEnd w:id="266217263"/>
     </w:p>
     <w:p>
       <w:pPr>
@@ -5064,6 +8113,7 @@
           <w:lang w:eastAsia="en-US" w:bidi="ar-SA"/>
         </w:rPr>
       </w:pPr>
+      <w:bookmarkStart w:name="_Toc1444872228" w:id="320678295"/>
       <w:r>
         <w:rPr/>
         <w:t>3</w:t>
@@ -5088,6 +8138,7 @@
         <w:rPr/>
         <w:t>NAS</w:t>
       </w:r>
+      <w:bookmarkEnd w:id="320678295"/>
     </w:p>
     <w:p>
       <w:pPr>
@@ -5188,6 +8239,7 @@
           <w:lang w:val="en-US"/>
         </w:rPr>
       </w:pPr>
+      <w:bookmarkStart w:name="_Toc1090721016" w:id="1394676409"/>
       <w:r>
         <w:rPr>
           <w:rFonts w:ascii="Arial" w:hAnsi="Arial" w:eastAsia="Arial" w:cs="Arial"/>
@@ -5216,6 +8268,7 @@
         </w:rPr>
         <w:t>Comparison of Classical NAS Paradigms</w:t>
       </w:r>
+      <w:bookmarkEnd w:id="1394676409"/>
     </w:p>
     <w:tbl>
       <w:tblPr>
@@ -5624,6 +8677,7 @@
           <w:lang w:val="en-US"/>
         </w:rPr>
       </w:pPr>
+      <w:bookmarkStart w:name="_Toc1459361674" w:id="196006161"/>
       <w:r>
         <w:rPr/>
         <w:t>3</w:t>
@@ -5644,6 +8698,7 @@
         <w:rPr/>
         <w:t>Efficiency-Oriented NAS</w:t>
       </w:r>
+      <w:bookmarkEnd w:id="196006161"/>
     </w:p>
     <w:p>
       <w:pPr>
@@ -5813,6 +8868,7 @@
           <w:lang w:val="en-GB"/>
         </w:rPr>
       </w:pPr>
+      <w:bookmarkStart w:name="_Toc612022560" w:id="213347241"/>
       <w:r>
         <w:rPr>
           <w:noProof w:val="0"/>
@@ -5848,6 +8904,7 @@
         </w:rPr>
         <w:t>ture Search</w:t>
       </w:r>
+      <w:bookmarkEnd w:id="213347241"/>
     </w:p>
     <w:p>
       <w:pPr>
@@ -6105,6 +9162,7 @@
           <w:lang w:val="en-GB"/>
         </w:rPr>
       </w:pPr>
+      <w:bookmarkStart w:name="_Toc2102214826" w:id="1362777153"/>
       <w:r>
         <w:rPr>
           <w:noProof w:val="0"/>
@@ -6126,6 +9184,7 @@
         </w:rPr>
         <w:t>2 One-Shot and Weight-Sharing NAS</w:t>
       </w:r>
+      <w:bookmarkEnd w:id="1362777153"/>
     </w:p>
     <w:p>
       <w:pPr>
@@ -6492,6 +9551,7 @@
           <w:lang w:val="en-GB" w:eastAsia="en-US" w:bidi="ar-SA"/>
         </w:rPr>
       </w:pPr>
+      <w:bookmarkStart w:name="_Toc1434987779" w:id="1791246284"/>
       <w:r>
         <w:rPr>
           <w:noProof w:val="0"/>
@@ -6499,6 +9559,7 @@
         </w:rPr>
         <w:t>3.4.3 Hardware-Aware and Sustainable NAS</w:t>
       </w:r>
+      <w:bookmarkEnd w:id="1791246284"/>
     </w:p>
     <w:p>
       <w:pPr>
@@ -6746,6 +9807,7 @@
           <w:lang w:val="en-GB" w:eastAsia="en-US" w:bidi="ar-SA"/>
         </w:rPr>
       </w:pPr>
+      <w:bookmarkStart w:name="_Toc150261818" w:id="1824581479"/>
       <w:r>
         <w:rPr>
           <w:noProof w:val="0"/>
@@ -6753,6 +9815,7 @@
         </w:rPr>
         <w:t>3.4.4 Comparative Analysis of Efficiency-Oriented NAS</w:t>
       </w:r>
+      <w:bookmarkEnd w:id="1824581479"/>
     </w:p>
     <w:p>
       <w:pPr>
@@ -7026,6 +10089,7 @@
           <w:lang w:val="en-GB"/>
         </w:rPr>
       </w:pPr>
+      <w:bookmarkStart w:name="_Toc359091427" w:id="1450467236"/>
       <w:r>
         <w:rPr>
           <w:rFonts w:ascii="Arial" w:hAnsi="Arial" w:eastAsia="Arial" w:cs="Arial"/>
@@ -7043,6 +10107,7 @@
         </w:rPr>
         <w:t>Table 02: Comparison of Efficiency-Oriented NAS Methods</w:t>
       </w:r>
+      <w:bookmarkEnd w:id="1450467236"/>
     </w:p>
     <w:tbl>
       <w:tblPr>
@@ -7452,6 +10517,7 @@
           <w:lang w:val="en-US"/>
         </w:rPr>
       </w:pPr>
+      <w:bookmarkStart w:name="_Toc1423345974" w:id="1093019218"/>
       <w:r>
         <w:rPr/>
         <w:t>3</w:t>
@@ -7472,6 +10538,7 @@
         <w:rPr/>
         <w:t>Toward Autonomous NAS</w:t>
       </w:r>
+      <w:bookmarkEnd w:id="1093019218"/>
     </w:p>
     <w:p>
       <w:pPr>
@@ -7999,6 +11066,7 @@
           <w:lang w:val="en-US"/>
         </w:rPr>
       </w:pPr>
+      <w:bookmarkStart w:name="_Toc1705128688" w:id="1870279846"/>
       <w:r>
         <w:rPr/>
         <w:t>3</w:t>
@@ -8019,6 +11087,7 @@
         <w:rPr/>
         <w:t>Research Gap and Positioning of Proposed Framework</w:t>
       </w:r>
+      <w:bookmarkEnd w:id="1870279846"/>
     </w:p>
     <w:p>
       <w:pPr>
@@ -8978,6 +12047,7 @@
           <w:lang w:val="en-GB"/>
         </w:rPr>
       </w:pPr>
+      <w:bookmarkStart w:name="_Toc996424859" w:id="799013704"/>
       <w:r>
         <w:rPr>
           <w:rFonts w:ascii="Arial" w:hAnsi="Arial" w:eastAsia="Arial" w:cs="Arial"/>
@@ -8995,6 +12065,7 @@
         </w:rPr>
         <w:t>Table 03: Positioning of the Proposed Framework</w:t>
       </w:r>
+      <w:bookmarkEnd w:id="799013704"/>
     </w:p>
     <w:tbl>
       <w:tblPr>
@@ -10341,6 +13412,7 @@
           <w:lang w:val="en-US"/>
         </w:rPr>
       </w:pPr>
+      <w:bookmarkStart w:name="_Toc732946639" w:id="572684948"/>
       <w:r>
         <w:rPr/>
         <w:t>4</w:t>
@@ -10353,6 +13425,7 @@
         <w:rPr/>
         <w:t>Methodology and System Design</w:t>
       </w:r>
+      <w:bookmarkEnd w:id="572684948"/>
     </w:p>
     <w:p>
       <w:pPr>
@@ -10364,6 +13437,7 @@
           <w:lang w:val="en-US"/>
         </w:rPr>
       </w:pPr>
+      <w:bookmarkStart w:name="_Toc5228534" w:id="1864428509"/>
       <w:r>
         <w:rPr/>
         <w:t>4</w:t>
@@ -10376,6 +13450,7 @@
         <w:rPr/>
         <w:t>Research Design</w:t>
       </w:r>
+      <w:bookmarkEnd w:id="1864428509"/>
     </w:p>
     <w:p>
       <w:pPr>
@@ -10947,6 +14022,7 @@
           <w:lang w:val="en-US"/>
         </w:rPr>
       </w:pPr>
+      <w:bookmarkStart w:name="_Toc1455901423" w:id="123470910"/>
       <w:r>
         <w:rPr/>
         <w:t>4</w:t>
@@ -10959,6 +14035,7 @@
         <w:rPr/>
         <w:t>System Architecture Overview</w:t>
       </w:r>
+      <w:bookmarkEnd w:id="123470910"/>
     </w:p>
     <w:p>
       <w:pPr>
@@ -11002,45 +14079,102 @@
     </w:p>
     <w:p>
       <w:pPr>
-        <w:pStyle w:val="Normal"/>
+        <w:pStyle w:val="Heading4"/>
+        <w:suppressLineNumbers w:val="0"/>
         <w:bidi w:val="0"/>
-        <w:ind w:left="708"/>
-      </w:pPr>
-      <w:r>
-        <w:rPr>
-          <w:rFonts w:ascii="Arial" w:hAnsi="Arial" w:eastAsia="Arial" w:cs="Arial"/>
-          <w:color w:val="auto"/>
+        <w:spacing w:before="80" w:beforeAutospacing="off" w:after="40" w:afterAutospacing="off" w:line="276" w:lineRule="auto"/>
+        <w:ind w:left="0" w:right="0"/>
+        <w:jc w:val="center"/>
+        <w:rPr>
+          <w:rFonts w:ascii="Arial" w:hAnsi="Arial" w:eastAsia="Arial" w:cs="Arial"/>
+          <w:b w:val="0"/>
+          <w:bCs w:val="0"/>
+          <w:i w:val="1"/>
+          <w:iCs w:val="1"/>
+          <w:caps w:val="0"/>
+          <w:smallCaps w:val="0"/>
+          <w:color w:val="auto"/>
+          <w:sz w:val="24"/>
+          <w:szCs w:val="24"/>
+        </w:rPr>
+      </w:pPr>
+      <w:bookmarkStart w:name="_Toc1745144943" w:id="53212860"/>
+      <w:r>
+        <w:rPr>
+          <w:rFonts w:ascii="Arial" w:hAnsi="Arial" w:eastAsia="Arial" w:cs="Arial"/>
+          <w:b w:val="0"/>
+          <w:bCs w:val="0"/>
+          <w:i w:val="1"/>
+          <w:iCs w:val="1"/>
+          <w:caps w:val="0"/>
+          <w:smallCaps w:val="0"/>
+          <w:color w:val="auto"/>
+          <w:sz w:val="24"/>
+          <w:szCs w:val="24"/>
         </w:rPr>
         <w:t xml:space="preserve">Diagram </w:t>
       </w:r>
       <w:r>
         <w:rPr>
           <w:rFonts w:ascii="Arial" w:hAnsi="Arial" w:eastAsia="Arial" w:cs="Arial"/>
-          <w:color w:val="auto"/>
+          <w:b w:val="0"/>
+          <w:bCs w:val="0"/>
+          <w:i w:val="1"/>
+          <w:iCs w:val="1"/>
+          <w:caps w:val="0"/>
+          <w:smallCaps w:val="0"/>
+          <w:color w:val="auto"/>
+          <w:sz w:val="24"/>
+          <w:szCs w:val="24"/>
         </w:rPr>
         <w:t>0</w:t>
       </w:r>
       <w:r>
         <w:rPr>
           <w:rFonts w:ascii="Arial" w:hAnsi="Arial" w:eastAsia="Arial" w:cs="Arial"/>
-          <w:color w:val="auto"/>
+          <w:b w:val="0"/>
+          <w:bCs w:val="0"/>
+          <w:i w:val="1"/>
+          <w:iCs w:val="1"/>
+          <w:caps w:val="0"/>
+          <w:smallCaps w:val="0"/>
+          <w:color w:val="auto"/>
+          <w:sz w:val="24"/>
+          <w:szCs w:val="24"/>
         </w:rPr>
         <w:t>1</w:t>
       </w:r>
       <w:r>
         <w:rPr>
           <w:rFonts w:ascii="Arial" w:hAnsi="Arial" w:eastAsia="Arial" w:cs="Arial"/>
-          <w:color w:val="auto"/>
+          <w:b w:val="0"/>
+          <w:bCs w:val="0"/>
+          <w:i w:val="1"/>
+          <w:iCs w:val="1"/>
+          <w:caps w:val="0"/>
+          <w:smallCaps w:val="0"/>
+          <w:color w:val="auto"/>
+          <w:sz w:val="24"/>
+          <w:szCs w:val="24"/>
         </w:rPr>
         <w:t xml:space="preserve">: </w:t>
       </w:r>
       <w:r>
         <w:rPr>
           <w:rFonts w:ascii="Arial" w:hAnsi="Arial" w:eastAsia="Arial" w:cs="Arial"/>
-          <w:color w:val="auto"/>
+          <w:b w:val="0"/>
+          <w:bCs w:val="0"/>
+          <w:i w:val="1"/>
+          <w:iCs w:val="1"/>
+          <w:caps w:val="0"/>
+          <w:smallCaps w:val="0"/>
+          <w:color w:val="auto"/>
+          <w:sz w:val="24"/>
+          <w:szCs w:val="24"/>
         </w:rPr>
         <w:t>Pipeline architecture of the proposed Agentic NAS framework</w:t>
       </w:r>
+      <w:bookmarkEnd w:id="53212860"/>
     </w:p>
     <w:p>
       <w:pPr>
@@ -11058,7 +14192,7 @@
       </w:pPr>
       <w:r>
         <w:drawing>
-          <wp:inline wp14:editId="7A0F2951" wp14:anchorId="7D7E02E3">
+          <wp:inline wp14:editId="4FB20FEA" wp14:anchorId="7D7E02E3">
             <wp:extent cx="2857060" cy="4905375"/>
             <wp:effectExtent l="0" t="0" r="0" b="0"/>
             <wp:docPr id="599054538" name="drawing"/>
@@ -11571,10 +14705,12 @@
           <w:color w:val="auto"/>
         </w:rPr>
       </w:pPr>
+      <w:bookmarkStart w:name="_Toc653213416" w:id="1491425929"/>
       <w:r>
         <w:rPr/>
         <w:t>4.3 Agent Roles and Responsibilities</w:t>
       </w:r>
+      <w:bookmarkEnd w:id="1491425929"/>
     </w:p>
     <w:p>
       <w:pPr>
@@ -11738,6 +14874,7 @@
           <w:lang w:val="en-GB"/>
         </w:rPr>
       </w:pPr>
+      <w:bookmarkStart w:name="_Toc239784296" w:id="960145400"/>
       <w:r>
         <w:rPr>
           <w:noProof w:val="0"/>
@@ -11759,6 +14896,7 @@
         </w:rPr>
         <w:t>: NAS Agents crew</w:t>
       </w:r>
+      <w:bookmarkEnd w:id="960145400"/>
     </w:p>
     <w:p>
       <w:pPr>
@@ -11866,6 +15004,7 @@
           <w:lang w:val="en-GB"/>
         </w:rPr>
       </w:pPr>
+      <w:bookmarkStart w:name="_Toc2100390308" w:id="1437707221"/>
       <w:r>
         <w:rPr>
           <w:noProof w:val="0"/>
@@ -11873,6 +15012,7 @@
         </w:rPr>
         <w:t>4.3.1 Profiler Agent</w:t>
       </w:r>
+      <w:bookmarkEnd w:id="1437707221"/>
     </w:p>
     <w:p>
       <w:pPr>
@@ -12135,6 +15275,7 @@
           <w:lang w:val="en-GB"/>
         </w:rPr>
       </w:pPr>
+      <w:bookmarkStart w:name="_Toc1933694693" w:id="780925506"/>
       <w:r>
         <w:rPr>
           <w:noProof w:val="0"/>
@@ -12142,6 +15283,7 @@
         </w:rPr>
         <w:t>4.3.2 Builder Agent</w:t>
       </w:r>
+      <w:bookmarkEnd w:id="780925506"/>
     </w:p>
     <w:p>
       <w:pPr>
@@ -12459,6 +15601,7 @@
           <w:lang w:val="en-GB"/>
         </w:rPr>
       </w:pPr>
+      <w:bookmarkStart w:name="_Toc1063422200" w:id="1257388428"/>
       <w:r>
         <w:rPr>
           <w:noProof w:val="0"/>
@@ -12466,6 +15609,7 @@
         </w:rPr>
         <w:t>4.3.3 Trainer Agent</w:t>
       </w:r>
+      <w:bookmarkEnd w:id="1257388428"/>
     </w:p>
     <w:p>
       <w:pPr>
@@ -12736,6 +15880,7 @@
           <w:lang w:val="en-GB"/>
         </w:rPr>
       </w:pPr>
+      <w:bookmarkStart w:name="_Toc240581063" w:id="2073856848"/>
       <w:r>
         <w:rPr>
           <w:noProof w:val="0"/>
@@ -12743,6 +15888,7 @@
         </w:rPr>
         <w:t>4.3.4 Evaluator Agent</w:t>
       </w:r>
+      <w:bookmarkEnd w:id="2073856848"/>
     </w:p>
     <w:p>
       <w:pPr>
@@ -12917,6 +16063,7 @@
           <w:lang w:val="en-GB"/>
         </w:rPr>
       </w:pPr>
+      <w:bookmarkStart w:name="_Toc1573395501" w:id="1198012047"/>
       <w:r>
         <w:rPr>
           <w:noProof w:val="0"/>
@@ -12924,6 +16071,7 @@
         </w:rPr>
         <w:t>4.3.5 Reporter Agent</w:t>
       </w:r>
+      <w:bookmarkEnd w:id="1198012047"/>
     </w:p>
     <w:p>
       <w:pPr>
@@ -13045,6 +16193,7 @@
           <w:lang w:val="en-GB"/>
         </w:rPr>
       </w:pPr>
+      <w:bookmarkStart w:name="_Toc1326775627" w:id="671987139"/>
       <w:r>
         <w:rPr>
           <w:noProof w:val="0"/>
@@ -13052,6 +16201,7 @@
         </w:rPr>
         <w:t>4.3.6 Inter-Agent Contracts and Separation of Concerns</w:t>
       </w:r>
+      <w:bookmarkEnd w:id="671987139"/>
     </w:p>
     <w:p>
       <w:pPr>
@@ -13215,10 +16365,12 @@
           <w:color w:val="auto"/>
         </w:rPr>
       </w:pPr>
+      <w:bookmarkStart w:name="_Toc2008103138" w:id="1251700202"/>
       <w:r>
         <w:rPr/>
         <w:t>4.4 Orchestration Workflow</w:t>
       </w:r>
+      <w:bookmarkEnd w:id="1251700202"/>
     </w:p>
     <w:p>
       <w:pPr>
@@ -13680,6 +16832,7 @@
           <w:lang w:val="en-GB"/>
         </w:rPr>
       </w:pPr>
+      <w:bookmarkStart w:name="_Toc1785549295" w:id="955948274"/>
       <w:r>
         <w:rPr>
           <w:rFonts w:ascii="Arial" w:hAnsi="Arial" w:eastAsia="Arial" w:cs="Arial"/>
@@ -13695,7 +16848,25 @@
           <w:szCs w:val="24"/>
           <w:lang w:val="en-GB"/>
         </w:rPr>
-        <w:t xml:space="preserve">Diagram 02: Illustration of Neural Architecture Search methods  </w:t>
+        <w:t>Diagram 02: Illustration of Neural Architecture Search methods</w:t>
+      </w:r>
+      <w:bookmarkEnd w:id="955948274"/>
+      <w:r>
+        <w:rPr>
+          <w:rFonts w:ascii="Arial" w:hAnsi="Arial" w:eastAsia="Arial" w:cs="Arial"/>
+          <w:b w:val="0"/>
+          <w:bCs w:val="0"/>
+          <w:i w:val="1"/>
+          <w:iCs w:val="1"/>
+          <w:caps w:val="0"/>
+          <w:smallCaps w:val="0"/>
+          <w:noProof w:val="0"/>
+          <w:color w:val="auto"/>
+          <w:sz w:val="24"/>
+          <w:szCs w:val="24"/>
+          <w:lang w:val="en-GB"/>
+        </w:rPr>
+        <w:t xml:space="preserve">  </w:t>
       </w:r>
       <w:r>
         <w:rPr>
@@ -13718,7 +16889,7 @@
       </w:pPr>
       <w:r>
         <w:drawing>
-          <wp:inline wp14:editId="2F410EC7" wp14:anchorId="57BAB591">
+          <wp:inline wp14:editId="1197F105" wp14:anchorId="57BAB591">
             <wp:extent cx="6181725" cy="1266825"/>
             <wp:effectExtent l="0" t="0" r="0" b="0"/>
             <wp:docPr id="1536652007" name="drawing"/>
@@ -14107,10 +17278,12 @@
           <w:color w:val="auto"/>
         </w:rPr>
       </w:pPr>
+      <w:bookmarkStart w:name="_Toc207471493" w:id="2027962051"/>
       <w:r>
         <w:rPr/>
         <w:t>4.5 Search and Optimisation Strategy</w:t>
       </w:r>
+      <w:bookmarkEnd w:id="2027962051"/>
     </w:p>
     <w:p>
       <w:pPr>
@@ -15077,10 +18250,12 @@
           <w:color w:val="auto"/>
         </w:rPr>
       </w:pPr>
+      <w:bookmarkStart w:name="_Toc794912406" w:id="1238096603"/>
       <w:r>
         <w:rPr/>
         <w:t>4.6 Memory, Logging and Artifact Persistence</w:t>
       </w:r>
+      <w:bookmarkEnd w:id="1238096603"/>
     </w:p>
     <w:p>
       <w:pPr>
@@ -15729,10 +18904,12 @@
           <w:color w:val="auto"/>
         </w:rPr>
       </w:pPr>
+      <w:bookmarkStart w:name="_Toc669814077" w:id="316840055"/>
       <w:r>
         <w:rPr/>
         <w:t>4.7 Experimental Setup</w:t>
       </w:r>
+      <w:bookmarkEnd w:id="316840055"/>
     </w:p>
     <w:p>
       <w:pPr>
@@ -16687,6 +19864,7 @@
           <w:lang w:val="en-GB"/>
         </w:rPr>
       </w:pPr>
+      <w:bookmarkStart w:name="_Toc1881273898" w:id="1898480280"/>
       <w:r>
         <w:rPr>
           <w:noProof w:val="0"/>
@@ -16708,6 +19886,7 @@
         </w:rPr>
         <w:t>) final answer</w:t>
       </w:r>
+      <w:bookmarkEnd w:id="1898480280"/>
     </w:p>
     <w:p>
       <w:pPr>
@@ -16722,7 +19901,7 @@
       </w:pPr>
       <w:r>
         <w:drawing>
-          <wp:inline wp14:editId="54F491F1" wp14:anchorId="2D58858F">
+          <wp:inline wp14:editId="09401BBE" wp14:anchorId="2D58858F">
             <wp:extent cx="6050796" cy="3952875"/>
             <wp:effectExtent l="0" t="0" r="0" b="0"/>
             <wp:docPr id="1346259141" name="drawing"/>
@@ -16887,7 +20066,12 @@
       <w:pPr>
         <w:pStyle w:val="sub-charpter"/>
         <w:bidi w:val="0"/>
-      </w:pPr>
+        <w:rPr>
+          <w:noProof w:val="0"/>
+          <w:lang w:val="en-GB"/>
+        </w:rPr>
+      </w:pPr>
+      <w:bookmarkStart w:name="_Toc689888176" w:id="1575304076"/>
       <w:r>
         <w:rPr>
           <w:noProof w:val="0"/>
@@ -16895,6 +20079,7 @@
         </w:rPr>
         <w:t>4.8 Testing and Validation</w:t>
       </w:r>
+      <w:bookmarkEnd w:id="1575304076"/>
     </w:p>
     <w:p>
       <w:pPr>
@@ -17320,6 +20505,7 @@
           <w:lang w:val="en-GB"/>
         </w:rPr>
       </w:pPr>
+      <w:bookmarkStart w:name="_Toc649964564" w:id="272319378"/>
       <w:r>
         <w:rPr>
           <w:rFonts w:ascii="Arial" w:hAnsi="Arial" w:eastAsia="Arial" w:cs="Arial"/>
@@ -17395,6 +20581,7 @@
         </w:rPr>
         <w:t>.</w:t>
       </w:r>
+      <w:bookmarkEnd w:id="272319378"/>
       <w:r>
         <w:rPr>
           <w:rFonts w:ascii="Arial" w:hAnsi="Arial" w:eastAsia="Arial" w:cs="Arial"/>
@@ -17429,7 +20616,7 @@
       </w:pPr>
       <w:r>
         <w:drawing>
-          <wp:inline wp14:editId="123AF4EC" wp14:anchorId="56CD88C6">
+          <wp:inline wp14:editId="67858323" wp14:anchorId="56CD88C6">
             <wp:extent cx="6181725" cy="3409950"/>
             <wp:effectExtent l="0" t="0" r="0" b="0"/>
             <wp:docPr id="1180231218" name="drawing"/>
@@ -17570,6 +20757,7 @@
           <w:lang w:val="en-US"/>
         </w:rPr>
       </w:pPr>
+      <w:bookmarkStart w:name="_Toc1455137770" w:id="625826750"/>
       <w:r>
         <w:rPr>
           <w:rFonts w:ascii="Arial" w:hAnsi="Arial" w:eastAsia="Arial" w:cs="Arial"/>
@@ -17591,6 +20779,7 @@
         </w:rPr>
         <w:t>Results and Discussion</w:t>
       </w:r>
+      <w:bookmarkEnd w:id="625826750"/>
     </w:p>
     <w:p>
       <w:pPr>
@@ -17607,12 +20796,21 @@
           <w:lang w:val="en-US"/>
         </w:rPr>
       </w:pPr>
-      <w:r>
-        <w:rPr>
-          <w:noProof w:val="0"/>
-          <w:lang w:val="en-GB"/>
-        </w:rPr>
-        <w:t xml:space="preserve">5.1 Pipeline Operational Validation </w:t>
+      <w:bookmarkStart w:name="_Toc443620057" w:id="376220736"/>
+      <w:r>
+        <w:rPr>
+          <w:noProof w:val="0"/>
+          <w:lang w:val="en-GB"/>
+        </w:rPr>
+        <w:t>5.1 Pipeline Operational Validation</w:t>
+      </w:r>
+      <w:bookmarkEnd w:id="376220736"/>
+      <w:r>
+        <w:rPr>
+          <w:noProof w:val="0"/>
+          <w:lang w:val="en-GB"/>
+        </w:rPr>
+        <w:t xml:space="preserve"> </w:t>
       </w:r>
     </w:p>
     <w:p>
@@ -17912,7 +21110,12 @@
       <w:pPr>
         <w:pStyle w:val="sub-charpter"/>
         <w:bidi w:val="0"/>
-      </w:pPr>
+        <w:rPr>
+          <w:noProof w:val="0"/>
+          <w:lang w:val="en-GB"/>
+        </w:rPr>
+      </w:pPr>
+      <w:bookmarkStart w:name="_Toc1389050218" w:id="487480128"/>
       <w:r>
         <w:rPr>
           <w:noProof w:val="0"/>
@@ -17920,6 +21123,7 @@
         </w:rPr>
         <w:t>5.2 Dataset Profiling Results</w:t>
       </w:r>
+      <w:bookmarkEnd w:id="487480128"/>
     </w:p>
     <w:p>
       <w:pPr>
@@ -18246,6 +21450,7 @@
           <w:lang w:val="en-GB"/>
         </w:rPr>
       </w:pPr>
+      <w:bookmarkStart w:name="_Toc1573274413" w:id="1252892187"/>
       <w:r>
         <w:rPr>
           <w:noProof w:val="0"/>
@@ -18281,6 +21486,7 @@
         </w:rPr>
         <w:t xml:space="preserve"> orchestration</w:t>
       </w:r>
+      <w:bookmarkEnd w:id="1252892187"/>
     </w:p>
     <w:p>
       <w:pPr>
@@ -18292,7 +21498,7 @@
       </w:pPr>
       <w:r>
         <w:drawing>
-          <wp:inline wp14:editId="275090C7" wp14:anchorId="72FF5D02">
+          <wp:inline wp14:editId="03901479" wp14:anchorId="72FF5D02">
             <wp:extent cx="3549863" cy="3084936"/>
             <wp:effectExtent l="0" t="0" r="0" b="0"/>
             <wp:docPr id="1781823608" name="drawing"/>
@@ -18366,7 +21572,12 @@
       <w:pPr>
         <w:pStyle w:val="sub-charpter"/>
         <w:bidi w:val="0"/>
-      </w:pPr>
+        <w:rPr>
+          <w:noProof w:val="0"/>
+          <w:lang w:val="en-GB"/>
+        </w:rPr>
+      </w:pPr>
+      <w:bookmarkStart w:name="_Toc1347913795" w:id="11935947"/>
       <w:r>
         <w:rPr>
           <w:noProof w:val="0"/>
@@ -18374,6 +21585,7 @@
         </w:rPr>
         <w:t>5.3 Search-Space Construction Results</w:t>
       </w:r>
+      <w:bookmarkEnd w:id="11935947"/>
     </w:p>
     <w:p>
       <w:pPr>
@@ -18630,6 +21842,7 @@
           <w:lang w:val="en-GB"/>
         </w:rPr>
       </w:pPr>
+      <w:bookmarkStart w:name="_Toc1656973723" w:id="1667649536"/>
       <w:r>
         <w:rPr>
           <w:noProof w:val="0"/>
@@ -18651,6 +21864,7 @@
         </w:rPr>
         <w:t>: Structured architecture planning output generated by the Builder Agent</w:t>
       </w:r>
+      <w:bookmarkEnd w:id="1667649536"/>
     </w:p>
     <w:p>
       <w:pPr>
@@ -18662,7 +21876,7 @@
       </w:pPr>
       <w:r>
         <w:drawing>
-          <wp:inline wp14:editId="09D7B92E" wp14:anchorId="4D956150">
+          <wp:inline wp14:editId="312F3717" wp14:anchorId="4D956150">
             <wp:extent cx="4238625" cy="3396125"/>
             <wp:effectExtent l="0" t="0" r="0" b="0"/>
             <wp:docPr id="369512581" name="drawing"/>
@@ -18736,7 +21950,12 @@
       <w:pPr>
         <w:pStyle w:val="sub-charpter"/>
         <w:bidi w:val="0"/>
-      </w:pPr>
+        <w:rPr>
+          <w:noProof w:val="0"/>
+          <w:lang w:val="en-GB"/>
+        </w:rPr>
+      </w:pPr>
+      <w:bookmarkStart w:name="_Toc1743309486" w:id="168918774"/>
       <w:r>
         <w:rPr>
           <w:noProof w:val="0"/>
@@ -18744,6 +21963,7 @@
         </w:rPr>
         <w:t>5.4 Optimisation Results</w:t>
       </w:r>
+      <w:bookmarkEnd w:id="168918774"/>
     </w:p>
     <w:p>
       <w:pPr>
@@ -18829,6 +22049,7 @@
           <w:lang w:val="en-GB"/>
         </w:rPr>
       </w:pPr>
+      <w:bookmarkStart w:name="_Toc2006207829" w:id="1518843098"/>
       <w:r>
         <w:rPr>
           <w:noProof w:val="0"/>
@@ -18850,6 +22071,7 @@
         </w:rPr>
         <w:t>: Structured architecture planning output generated by the Builder Agent</w:t>
       </w:r>
+      <w:bookmarkEnd w:id="1518843098"/>
     </w:p>
     <w:p>
       <w:pPr>
@@ -18861,7 +22083,7 @@
       </w:pPr>
       <w:r>
         <w:drawing>
-          <wp:inline wp14:editId="5C7423EB" wp14:anchorId="06DEA614">
+          <wp:inline wp14:editId="66A0959B" wp14:anchorId="06DEA614">
             <wp:extent cx="4385050" cy="2844539"/>
             <wp:effectExtent l="0" t="0" r="0" b="0"/>
             <wp:docPr id="534712259" name="drawing"/>
@@ -19169,7 +22391,12 @@
       <w:pPr>
         <w:pStyle w:val="sub-charpter"/>
         <w:bidi w:val="0"/>
-      </w:pPr>
+        <w:rPr>
+          <w:noProof w:val="0"/>
+          <w:lang w:val="en-GB"/>
+        </w:rPr>
+      </w:pPr>
+      <w:bookmarkStart w:name="_Toc317867808" w:id="1517800764"/>
       <w:r>
         <w:rPr>
           <w:noProof w:val="0"/>
@@ -19177,6 +22404,7 @@
         </w:rPr>
         <w:t>5.5 Evaluation and Model Selection</w:t>
       </w:r>
+      <w:bookmarkEnd w:id="1517800764"/>
     </w:p>
     <w:p>
       <w:pPr>
@@ -19399,6 +22627,7 @@
           <w:lang w:val="en-GB"/>
         </w:rPr>
       </w:pPr>
+      <w:bookmarkStart w:name="_Toc680452538" w:id="1655243305"/>
       <w:r>
         <w:rPr>
           <w:noProof w:val="0"/>
@@ -19448,6 +22677,7 @@
         </w:rPr>
         <w:t>produced by the Evaluator Agent</w:t>
       </w:r>
+      <w:bookmarkEnd w:id="1655243305"/>
     </w:p>
     <w:p>
       <w:pPr>
@@ -19458,7 +22688,7 @@
       </w:pPr>
       <w:r>
         <w:drawing>
-          <wp:inline wp14:editId="6333F911" wp14:anchorId="4BB61D62">
+          <wp:inline wp14:editId="2AAF0BF4" wp14:anchorId="4BB61D62">
             <wp:extent cx="4013266" cy="2362200"/>
             <wp:effectExtent l="0" t="0" r="0" b="0"/>
             <wp:docPr id="492148624" name="drawing"/>
@@ -19532,7 +22762,12 @@
       <w:pPr>
         <w:pStyle w:val="sub-charpter"/>
         <w:bidi w:val="0"/>
-      </w:pPr>
+        <w:rPr>
+          <w:noProof w:val="0"/>
+          <w:lang w:val="en-GB"/>
+        </w:rPr>
+      </w:pPr>
+      <w:bookmarkStart w:name="_Toc1009645308" w:id="821010802"/>
       <w:r>
         <w:rPr>
           <w:noProof w:val="0"/>
@@ -19540,6 +22775,7 @@
         </w:rPr>
         <w:t>5.6 Discussion</w:t>
       </w:r>
+      <w:bookmarkEnd w:id="821010802"/>
     </w:p>
     <w:p>
       <w:pPr>
@@ -19770,6 +23006,7 @@
           <w:lang w:val="en-GB"/>
         </w:rPr>
       </w:pPr>
+      <w:bookmarkStart w:name="_Toc1684890337" w:id="495258764"/>
       <w:r>
         <w:rPr>
           <w:rFonts w:ascii="Arial" w:hAnsi="Arial" w:eastAsia="Arial" w:cs="Arial"/>
@@ -19787,6 +23024,7 @@
         </w:rPr>
         <w:t>Table 04: Positioning of the Proposed Framework</w:t>
       </w:r>
+      <w:bookmarkEnd w:id="495258764"/>
     </w:p>
     <w:tbl>
       <w:tblPr>
@@ -20321,6 +23559,7 @@
           <w:lang w:val="en-GB"/>
         </w:rPr>
       </w:pPr>
+      <w:bookmarkStart w:name="_Toc1855459851" w:id="1718157842"/>
       <w:r>
         <w:rPr>
           <w:noProof w:val="0"/>
@@ -20339,6 +23578,7 @@
         </w:rPr>
         <w:t>Conclusion and Broader Implications</w:t>
       </w:r>
+      <w:bookmarkEnd w:id="1718157842"/>
     </w:p>
     <w:p>
       <w:pPr>
@@ -20864,6 +24104,7 @@
           <w:szCs w:val="40"/>
         </w:rPr>
       </w:pPr>
+      <w:bookmarkStart w:name="_Toc80453346" w:id="755313119"/>
       <w:r>
         <w:rPr>
           <w:rFonts w:ascii="Arial" w:hAnsi="Arial" w:eastAsia="Arial" w:cs="Arial"/>
@@ -20891,6 +24132,7 @@
         </w:rPr>
         <w:t>Bibliography</w:t>
       </w:r>
+      <w:bookmarkEnd w:id="755313119"/>
     </w:p>
     <w:p>
       <w:pPr>
@@ -21179,7 +24421,7 @@
         </w:rPr>
         <w:t xml:space="preserve">. Available at: </w:t>
       </w:r>
-      <w:hyperlink r:id="Raee13e4e936f46eb">
+      <w:hyperlink r:id="R3282c68e0ac54089">
         <w:r>
           <w:rPr>
             <w:rStyle w:val="Hyperlink"/>
@@ -21668,7 +24910,7 @@
         </w:rPr>
         <w:t xml:space="preserve">. Available at: </w:t>
       </w:r>
-      <w:hyperlink r:id="R6f7b4e5185d445f5">
+      <w:hyperlink r:id="R41b16b9da3204586">
         <w:r>
           <w:rPr>
             <w:rStyle w:val="Hyperlink"/>
@@ -22577,7 +25819,7 @@
         </w:rPr>
         <w:t xml:space="preserve">. Available at: </w:t>
       </w:r>
-      <w:hyperlink r:id="R62fa51be953141ab">
+      <w:hyperlink r:id="Rf5fe3008829a48ff">
         <w:r>
           <w:rPr>
             <w:rStyle w:val="Hyperlink"/>
@@ -22865,7 +26107,7 @@
         </w:rPr>
         <w:t xml:space="preserve">. Available at: </w:t>
       </w:r>
-      <w:hyperlink r:id="Re35e389131c14f25">
+      <w:hyperlink r:id="R0db5c2d817c848ce">
         <w:r>
           <w:rPr>
             <w:rStyle w:val="Hyperlink"/>
@@ -23360,6 +26602,7 @@
           <w:szCs w:val="40"/>
         </w:rPr>
       </w:pPr>
+      <w:bookmarkStart w:name="_Toc190237094" w:id="1417723202"/>
       <w:r>
         <w:rPr>
           <w:rFonts w:ascii="Arial" w:hAnsi="Arial" w:eastAsia="Arial" w:cs="Arial"/>
@@ -23369,20 +26612,24 @@
         </w:rPr>
         <w:t>8. Appendices</w:t>
       </w:r>
+      <w:bookmarkEnd w:id="1417723202"/>
     </w:p>
     <w:p>
       <w:pPr>
         <w:pStyle w:val="sub-charpter"/>
       </w:pPr>
+      <w:bookmarkStart w:name="_Toc1280569866" w:id="301674173"/>
       <w:r>
         <w:rPr/>
         <w:t>Appendix A — Datasets Used in Experimental Validation</w:t>
       </w:r>
+      <w:bookmarkEnd w:id="301674173"/>
     </w:p>
     <w:p>
       <w:pPr>
         <w:pStyle w:val="sub-sub-charpter"/>
       </w:pPr>
+      <w:bookmarkStart w:name="_Toc444371046" w:id="2056892675"/>
       <w:r>
         <w:rPr/>
         <w:t xml:space="preserve">A.1 ECG Sleep </w:t>
@@ -23395,6 +26642,7 @@
         <w:rPr/>
         <w:t xml:space="preserve"> Dataset (Primary Experimental Dataset)</w:t>
       </w:r>
+      <w:bookmarkEnd w:id="2056892675"/>
     </w:p>
     <w:p>
       <w:pPr>
@@ -24337,7 +27585,7 @@
           <w:bCs w:val="1"/>
         </w:rPr>
       </w:pPr>
-      <w:hyperlink r:id="Rc265d2558abc4fdc">
+      <w:hyperlink r:id="Re3f2d551d7fa4455">
         <w:r>
           <w:rPr>
             <w:rStyle w:val="Hyperlink"/>
@@ -25140,7 +28388,7 @@
         <w:pStyle w:val="bodytextnas"/>
         <w:ind w:firstLine="0"/>
       </w:pPr>
-      <w:hyperlink r:id="Rccd5466f862c470b">
+      <w:hyperlink r:id="Rc1a7f226575c445e">
         <w:r>
           <w:rPr>
             <w:rStyle w:val="Hyperlink"/>
@@ -25151,7 +28399,7 @@
       <w:r>
         <w:br/>
       </w:r>
-      <w:hyperlink r:id="Rd67a15e6f8ae481f">
+      <w:hyperlink r:id="Re1b1a29f55694392">
         <w:r>
           <w:rPr>
             <w:rStyle w:val="Hyperlink"/>
@@ -25184,7 +28432,7 @@
       </w:pPr>
       <w:r>
         <w:drawing>
-          <wp:inline wp14:editId="1867BEA0" wp14:anchorId="30F11BB2">
+          <wp:inline wp14:editId="4CA3F7E8" wp14:anchorId="30F11BB2">
             <wp:extent cx="6181725" cy="2152650"/>
             <wp:effectExtent l="0" t="0" r="0" b="0"/>
             <wp:docPr id="882912924" name="drawing"/>
@@ -25321,10 +28569,12 @@
       <w:pPr>
         <w:pStyle w:val="sub-sub-charpter"/>
       </w:pPr>
+      <w:bookmarkStart w:name="_Toc1371765763" w:id="1735494624"/>
       <w:r>
         <w:rPr/>
         <w:t>A.3 Dataset Selection Rationale</w:t>
       </w:r>
+      <w:bookmarkEnd w:id="1735494624"/>
     </w:p>
     <w:p>
       <w:pPr>
@@ -25745,15 +28995,26 @@
         <w:pStyle w:val="sub-charpter"/>
         <w:ind w:firstLine="0"/>
       </w:pPr>
+      <w:bookmarkStart w:name="_Toc1309282674" w:id="264042454"/>
       <w:r>
         <w:rPr/>
-        <w:t xml:space="preserve">Appendix B — Example Pipeline Artifacts </w:t>
+        <w:t>Appendix B — Example Pipeline Artifacts</w:t>
+      </w:r>
+      <w:bookmarkEnd w:id="264042454"/>
+      <w:r>
+        <w:rPr/>
+        <w:t xml:space="preserve"> </w:t>
       </w:r>
     </w:p>
     <w:p>
       <w:pPr>
         <w:pStyle w:val="sub-charpter"/>
-      </w:pPr>
+        <w:rPr>
+          <w:noProof w:val="0"/>
+          <w:lang w:val="en-GB"/>
+        </w:rPr>
+      </w:pPr>
+      <w:bookmarkStart w:name="_Toc132138356" w:id="313081003"/>
       <w:r>
         <w:rPr>
           <w:noProof w:val="0"/>
@@ -25761,6 +29022,7 @@
         </w:rPr>
         <w:t>B.1 Run Manifest</w:t>
       </w:r>
+      <w:bookmarkEnd w:id="313081003"/>
     </w:p>
     <w:p>
       <w:pPr>
@@ -27460,7 +30722,12 @@
     <w:p>
       <w:pPr>
         <w:pStyle w:val="sub-charpter"/>
-      </w:pPr>
+        <w:rPr>
+          <w:noProof w:val="0"/>
+          <w:lang w:val="en-GB"/>
+        </w:rPr>
+      </w:pPr>
+      <w:bookmarkStart w:name="_Toc1757029820" w:id="154827102"/>
       <w:r>
         <w:rPr>
           <w:noProof w:val="0"/>
@@ -27468,6 +30735,7 @@
         </w:rPr>
         <w:t>B.2 Example Profiler Output</w:t>
       </w:r>
+      <w:bookmarkEnd w:id="154827102"/>
     </w:p>
     <w:p>
       <w:pPr>
@@ -27973,7 +31241,12 @@
     <w:p>
       <w:pPr>
         <w:pStyle w:val="sub-charpter"/>
-      </w:pPr>
+        <w:rPr>
+          <w:noProof w:val="0"/>
+          <w:lang w:val="en-GB"/>
+        </w:rPr>
+      </w:pPr>
+      <w:bookmarkStart w:name="_Toc682848272" w:id="418901483"/>
       <w:r>
         <w:rPr>
           <w:noProof w:val="0"/>
@@ -27981,6 +31254,7 @@
         </w:rPr>
         <w:t>B.3 Example Builder Output</w:t>
       </w:r>
+      <w:bookmarkEnd w:id="418901483"/>
     </w:p>
     <w:p>
       <w:pPr>
@@ -28340,7 +31614,12 @@
     <w:p>
       <w:pPr>
         <w:pStyle w:val="sub-charpter"/>
-      </w:pPr>
+        <w:rPr>
+          <w:noProof w:val="0"/>
+          <w:lang w:val="en-GB"/>
+        </w:rPr>
+      </w:pPr>
+      <w:bookmarkStart w:name="_Toc1212611504" w:id="507080914"/>
       <w:r>
         <w:rPr>
           <w:noProof w:val="0"/>
@@ -28348,6 +31627,7 @@
         </w:rPr>
         <w:t>B.4 Example Training Output</w:t>
       </w:r>
+      <w:bookmarkEnd w:id="507080914"/>
     </w:p>
     <w:p>
       <w:pPr>
@@ -28759,7 +32039,12 @@
     <w:p>
       <w:pPr>
         <w:pStyle w:val="sub-charpter"/>
-      </w:pPr>
+        <w:rPr>
+          <w:noProof w:val="0"/>
+          <w:lang w:val="en-GB"/>
+        </w:rPr>
+      </w:pPr>
+      <w:bookmarkStart w:name="_Toc341856623" w:id="2042099206"/>
       <w:r>
         <w:rPr>
           <w:noProof w:val="0"/>
@@ -28767,6 +32052,7 @@
         </w:rPr>
         <w:t>B.5 Final Generated Report</w:t>
       </w:r>
+      <w:bookmarkEnd w:id="2042099206"/>
     </w:p>
     <w:p>
       <w:pPr>
@@ -28774,7 +32060,7 @@
       </w:pPr>
       <w:r>
         <w:drawing>
-          <wp:inline wp14:editId="5D30886C" wp14:anchorId="789EC60B">
+          <wp:inline wp14:editId="38C1B8BB" wp14:anchorId="789EC60B">
             <wp:extent cx="4494865" cy="4162425"/>
             <wp:effectExtent l="0" t="0" r="0" b="0"/>
             <wp:docPr id="848372707" name="drawing"/>
@@ -28829,7 +32115,12 @@
     <w:p>
       <w:pPr>
         <w:pStyle w:val="sub-charpter"/>
-      </w:pPr>
+        <w:rPr>
+          <w:noProof w:val="0"/>
+          <w:lang w:val="en-GB"/>
+        </w:rPr>
+      </w:pPr>
+      <w:bookmarkStart w:name="_Toc1217813014" w:id="1265265672"/>
       <w:r>
         <w:rPr>
           <w:noProof w:val="0"/>
@@ -28837,6 +32128,7 @@
         </w:rPr>
         <w:t>B.6 Artefact Directory Structure</w:t>
       </w:r>
+      <w:bookmarkEnd w:id="1265265672"/>
     </w:p>
     <w:p>
       <w:pPr>
@@ -28845,7 +32137,7 @@
       </w:pPr>
       <w:r>
         <w:drawing>
-          <wp:inline wp14:editId="37FBACEC" wp14:anchorId="3C3F509C">
+          <wp:inline wp14:editId="547C49F0" wp14:anchorId="3C3F509C">
             <wp:extent cx="1819943" cy="2231203"/>
             <wp:effectExtent l="0" t="0" r="0" b="0"/>
             <wp:docPr id="1490947726" name="drawing"/>
@@ -28902,7 +32194,12 @@
     <w:p>
       <w:pPr>
         <w:pStyle w:val="nasheaders"/>
-      </w:pPr>
+        <w:rPr>
+          <w:noProof w:val="0"/>
+          <w:lang w:val="en-GB"/>
+        </w:rPr>
+      </w:pPr>
+      <w:bookmarkStart w:name="_Toc400237606" w:id="1862359003"/>
       <w:r>
         <w:rPr>
           <w:noProof w:val="0"/>
@@ -28910,6 +32207,7 @@
         </w:rPr>
         <w:t>Appendix C — AI-Assisted Development Disclosure</w:t>
       </w:r>
+      <w:bookmarkEnd w:id="1862359003"/>
     </w:p>
     <w:p>
       <w:pPr>
@@ -36956,7 +40254,7 @@
     <w:basedOn w:val="Normal"/>
     <w:link w:val="nasheadersChar"/>
     <w:qFormat/>
-    <w:rsid w:val="4A5A2F4A"/>
+    <w:rsid w:val="28F057F9"/>
     <w:rPr>
       <w:rFonts w:ascii="Arial" w:hAnsi="Arial" w:eastAsia="Arial" w:cs="Arial" w:asciiTheme="majorAscii" w:hAnsiTheme="majorAscii" w:eastAsiaTheme="majorEastAsia" w:cstheme="majorBidi"/>
       <w:color w:val="auto"/>
@@ -36974,7 +40272,7 @@
     <w:name w:val="nas headers Char"/>
     <w:basedOn w:val="DefaultParagraphFont"/>
     <w:link w:val="nasheaders"/>
-    <w:rsid w:val="4A5A2F4A"/>
+    <w:rsid w:val="28F057F9"/>
     <w:rPr>
       <w:rFonts w:ascii="Arial" w:hAnsi="Arial" w:eastAsia="Arial" w:cs="Arial" w:asciiTheme="majorAscii" w:hAnsiTheme="majorAscii" w:eastAsiaTheme="majorEastAsia" w:cstheme="majorBidi"/>
       <w:noProof w:val="0"/>
@@ -36990,7 +40288,7 @@
     <w:basedOn w:val="Normal"/>
     <w:next w:val="Normal"/>
     <w:qFormat/>
-    <w:rsid w:val="4A5A2F4A"/>
+    <w:rsid w:val="28F057F9"/>
     <w:rPr>
       <w:rFonts w:eastAsia="" w:cs="" w:eastAsiaTheme="majorEastAsia" w:cstheme="majorBidi"/>
       <w:color w:val="595959" w:themeColor="text1" w:themeTint="A6" w:themeShade="FF"/>

</xml_diff>